<commit_message>
Canonicalize railway assistant design and sync project docs
</commit_message>
<xml_diff>
--- a/Design/Early Locomotion Design Reference.docx
+++ b/Design/Early Locomotion Design Reference.docx
@@ -474,6 +474,286 @@
         <w:pStyle w:val="Heading1"/>
       </w:pPr>
       <w:r>
+        <w:t>Railway Assistant &amp; Animated Tutorial System</w:t>
+      </w:r>
+    </w:p>
+    <w:p>
+      <w:pPr/>
+      <w:r>
+        <w:t>Approved design addition recorded on 20 September 2026, following The Manager's review and the user's explicit approval of the requirements and status split. The groups below distinguish approved behaviour from proposed presentation and unresolved choices.</w:t>
+      </w:r>
+    </w:p>
+    <w:p>
+      <w:pPr>
+        <w:pStyle w:val="Heading2"/>
+      </w:pPr>
+      <w:r>
+        <w:t>Confirmed / Agreed</w:t>
+      </w:r>
+    </w:p>
+    <w:p>
+      <w:pPr>
+        <w:pStyle w:val="Heading3"/>
+      </w:pPr>
+      <w:r>
+        <w:t>Scripted railway-assistant character</w:t>
+      </w:r>
+    </w:p>
+    <w:p>
+      <w:pPr/>
+      <w:r>
+        <w:t>Early Locomotion has its own scripted, voiced railway-assistant character, distinct from ADA in personality and presentation. She is bubbly, enthusiastic, expressive, noticeably more alive/emotive than ADA, and genuinely eager to help. She is whimsical without becoming random or obnoxiously hyperactive, and competent as an instructor.</w:t>
+      </w:r>
+    </w:p>
+    <w:p>
+      <w:pPr/>
+      <w:r>
+        <w:t>Her enthusiasm centres on railways, railway engineering, signalling, locomotives, and teaching, rather than generic “quirky AI” behaviour. She should feel like an enthusiastic new recruit delighted to finally have a job. The user currently intends to voice her personally, enabling bespoke Early Locomotion guidance without requiring ADA's voice actor. This is a scripted character, not generative/live AI behaviour.</w:t>
+      </w:r>
+    </w:p>
+    <w:p>
+      <w:pPr>
+        <w:pStyle w:val="Heading3"/>
+      </w:pPr>
+      <w:r>
+        <w:t>First appearance</w:t>
+      </w:r>
+    </w:p>
+    <w:p>
+      <w:pPr/>
+      <w:r>
+        <w:t>The assistant first appears when the player enters Early Locomotion progression: the first applicable Early Locomotion milestone/technology unlock triggers the introduction, whichever qualifying unlock occurs first. The introduction initially resembles the normal Satisfactory/FICSIT/ADA announcement presentation. When ADA would normally appear, the interface appears to glitch or be interrupted/taken over by the railway assistant.</w:t>
+      </w:r>
+    </w:p>
+    <w:p>
+      <w:pPr/>
+      <w:r>
+        <w:t>The sequence is humorous, surprising, and clearly different from ADA, never sinister or horror-themed. She need not claim to have “hacked FICSIT”; the preferred tone is that she takes over and behaves as though this is completely ordinary. Exact presentation details and implementation remain non-canonical until technically verified.</w:t>
+      </w:r>
+    </w:p>
+    <w:p>
+      <w:pPr>
+        <w:pStyle w:val="Heading3"/>
+      </w:pPr>
+      <w:r>
+        <w:t>Teaching purpose and scope</w:t>
+      </w:r>
+    </w:p>
+    <w:p>
+      <w:pPr/>
+      <w:r>
+        <w:t>Her major gameplay function is railway education and Early Locomotion-specific guidance. She may provide bespoke narration/dialogue for appropriate milestones and railway concepts. She teaches principles and leaves railway construction and problem-solving to the player; player agency remains intact.</w:t>
+      </w:r>
+    </w:p>
+    <w:p>
+      <w:pPr/>
+      <w:r>
+        <w:t>She is not a live railway-management system. Explicitly out of scope are inspecting the player's live railway network, analysing current network state, automatically diagnosing signal problems, calculating routes, managing trains, automatically fixing railway designs, automatically placing signals, live railway optimisation, and generative conversational AI.</w:t>
+      </w:r>
+    </w:p>
+    <w:p>
+      <w:pPr>
+        <w:pStyle w:val="Heading3"/>
+      </w:pPr>
+      <w:r>
+        <w:t>Animated tutorials and progressive availability</w:t>
+      </w:r>
+    </w:p>
+    <w:p>
+      <w:pPr/>
+      <w:r>
+        <w:t>Early Locomotion includes an integrated animated railway tutorial/library system. Minecraft Create's Ponder system is an inspiration for the interaction philosophy only, not an implementation dependency or a system to copy directly.</w:t>
+      </w:r>
+    </w:p>
+    <w:p>
+      <w:pPr/>
+      <w:r>
+        <w:t>Animated miniature demonstrations teach visually rather than relying primarily on written documentation. Each demonstration focuses on one railway principle, animates the relevant track/trains/infrastructure, pauses or emphasises important stages, and uses short explanatory captions. Demonstrations remain instructional and do not solve the player's real railway automatically. Scripted pauses/emphasis are distinct from the proposed player playback controls below.</w:t>
+      </w:r>
+    </w:p>
+    <w:p>
+      <w:pPr/>
+      <w:r>
+        <w:t>Tutorial material becomes available alongside the technology/mechanics needed to use it: signalling lessons should not appear before signalling technology exists, and advanced lessons should not precede their corresponding systems. The first railway remains approachable, with operational complexity, signalling, servicing, and advanced railway engineering introduced and taught progressively as they become relevant.</w:t>
+      </w:r>
+    </w:p>
+    <w:p>
+      <w:pPr/>
+      <w:r>
+        <w:t>This feature complements conventional steam infrastructure, progressive railway introduction, simple first routes, increasing signalling complexity, semaphore/block signalling, signal boxes, fuel/water logistics, station/service infrastructure, and operational railway problem-solving.</w:t>
+      </w:r>
+    </w:p>
+    <w:p>
+      <w:pPr>
+        <w:pStyle w:val="Heading3"/>
+      </w:pPr>
+      <w:r>
+        <w:t>Release audio requirement</w:t>
+      </w:r>
+    </w:p>
+    <w:p>
+      <w:pPr/>
+      <w:r>
+        <w:t>The brainstorming reference to the Windows XP startup sound is not an approved release asset. Release audio must use an original, legally distinct retro-computer-style startup jingle unless rights to any third-party copyrighted audio are separately established.</w:t>
+      </w:r>
+    </w:p>
+    <w:p>
+      <w:pPr>
+        <w:pStyle w:val="Heading2"/>
+      </w:pPr>
+      <w:r>
+        <w:t>Proposed</w:t>
+      </w:r>
+    </w:p>
+    <w:p>
+      <w:pPr>
+        <w:pStyle w:val="Heading3"/>
+      </w:pPr>
+      <w:r>
+        <w:t>Tutorial presentation</w:t>
+      </w:r>
+    </w:p>
+    <w:p>
+      <w:pPr/>
+      <w:r>
+        <w:t>A clean white miniature model-railway demonstration table, with IKEA/display-table-like simplicity and miniature Early Locomotion track, locomotives, wagons, stations, signals, and service infrastructure, is a strong current direction rather than a final choice. The presentation would be intentionally clean and instructional.</w:t>
+      </w:r>
+    </w:p>
+    <w:p>
+      <w:pPr>
+        <w:pStyle w:val="Heading3"/>
+      </w:pPr>
+      <w:r>
+        <w:t>Tutorial controls and library UI</w:t>
+      </w:r>
+    </w:p>
+    <w:p>
+      <w:pPr/>
+      <w:r>
+        <w:t>Proposed controls, where practical, include pause, replay, and stepping forwards/backwards or staged progression. Their exact scheme and feasibility are not approved. A vertical subject/category list and logical subject grouping are proposed library layout choices. That layout would expose progressive availability based on unlock state; progressive tutorial availability itself is Agreed above.</w:t>
+      </w:r>
+    </w:p>
+    <w:p>
+      <w:pPr>
+        <w:pStyle w:val="Heading3"/>
+      </w:pPr>
+      <w:r>
+        <w:t>Visual language and possible lore implication</w:t>
+      </w:r>
+    </w:p>
+    <w:p>
+      <w:pPr/>
+      <w:r>
+        <w:t>The proposed UI is recognisably FICSIT-derived but appears older than current FICSIT UI: cleaner, more instructional, less aggressively corporate/efficiency-focused, and archival/prototype in character. It may imply that the assistant belongs to or originated from an earlier FICSIT era. That implication is not confirmed lore.</w:t>
+      </w:r>
+    </w:p>
+    <w:p>
+      <w:pPr>
+        <w:pStyle w:val="Heading3"/>
+      </w:pPr>
+      <w:r>
+        <w:t>Expanded content</w:t>
+      </w:r>
+    </w:p>
+    <w:p>
+      <w:pPr/>
+      <w:r>
+        <w:t>Later/proposed possibilities include specialised railway lessons, common-mistakes demonstrations, additional character flavour dialogue/animations, a larger tutorial catalogue, advanced junction/passing-loop/signalling demonstrations, and additional milestone narration structure. No launch tutorial roster is defined by this approval.</w:t>
+      </w:r>
+    </w:p>
+    <w:p>
+      <w:pPr>
+        <w:pStyle w:val="Heading2"/>
+      </w:pPr>
+      <w:r>
+        <w:t>Open Questions</w:t>
+      </w:r>
+    </w:p>
+    <w:p>
+      <w:pPr>
+        <w:pStyle w:val="ListBullet"/>
+      </w:pPr>
+      <w:r/>
+      <w:r>
+        <w:rPr>
+          <w:b/>
+        </w:rPr>
+        <w:t>OQ15 — Character and presentation:</w:t>
+      </w:r>
+      <w:r>
+        <w:t xml:space="preserve"> What is the assistant's final name? What is the exact introductory dialogue? What avatar/visual character design, if any, and colour palette should be used? What is the final library/interface layout?</w:t>
+      </w:r>
+    </w:p>
+    <w:p>
+      <w:pPr>
+        <w:pStyle w:val="ListBullet"/>
+      </w:pPr>
+      <w:r/>
+      <w:r>
+        <w:rPr>
+          <w:b/>
+        </w:rPr>
+        <w:t>OQ16 — Historical origin and lore:</w:t>
+      </w:r>
+      <w:r>
+        <w:t xml:space="preserve"> Is her historical origin ever explicitly explained? Does the older-FICSIT presentation represent real project lore or remain visual implication only?</w:t>
+      </w:r>
+    </w:p>
+    <w:p>
+      <w:pPr>
+        <w:pStyle w:val="ListBullet"/>
+      </w:pPr>
+      <w:r/>
+      <w:r>
+        <w:rPr>
+          <w:b/>
+        </w:rPr>
+        <w:t>OQ17 — Tutorial content and narration:</w:t>
+      </w:r>
+      <w:r>
+        <w:t xml:space="preserve"> What is the exact launch tutorial roster? Which technology/unlock grants each tutorial? What is the exact milestone voice-line structure?</w:t>
+      </w:r>
+    </w:p>
+    <w:p>
+      <w:pPr>
+        <w:pStyle w:val="ListBullet"/>
+      </w:pPr>
+      <w:r/>
+      <w:r>
+        <w:rPr>
+          <w:b/>
+        </w:rPr>
+        <w:t>OQ18 — Tutorial and assistant implementation:</w:t>
+      </w:r>
+      <w:r>
+        <w:t xml:space="preserve"> What are the exact playback controls and first-unlock trigger implementation? How is the ADA-style takeover/presentation implemented? Should it imitate/intercept vanilla ADA presentation or recreate the effect independently? How are animated miniature demonstrations, progressive tutorial unlock tracking, and voice/audio integration implemented? Each implementation-related choice requires technical verification against the real Satisfactory/SML/Unreal environment.</w:t>
+      </w:r>
+    </w:p>
+    <w:p>
+      <w:pPr>
+        <w:pStyle w:val="Heading3"/>
+      </w:pPr>
+      <w:r>
+        <w:t>Technical verification required</w:t>
+      </w:r>
+    </w:p>
+    <w:p>
+      <w:pPr/>
+      <w:r>
+        <w:t>The following capabilities remain unverified: intercepting or recreating ADA-style announcement presentation; triggering the introduction exactly once; custom tutorial/library UI; animated miniature demonstrations; progressive tutorial unlock tracking; pause/replay/step functionality; and custom voice/audio integration.</w:t>
+      </w:r>
+    </w:p>
+    <w:p>
+      <w:pPr/>
+      <w:r>
+        <w:t>Investigate whether the desired “ADA takeover” illusion can be reproduced independently instead of modifying/intercepting ADA's actual presentation system. This may be safer for compatibility, but no implementation decision has been made. No APIs, class names, hooks, Blueprints, or implementation architecture are specified by this design approval.</w:t>
+      </w:r>
+    </w:p>
+    <w:p>
+      <w:pPr>
+        <w:pStyle w:val="Heading1"/>
+      </w:pPr>
+      <w:r>
         <w:t>Open questions</w:t>
       </w:r>
     </w:p>
@@ -591,6 +871,14 @@
     </w:p>
     <w:p>
       <w:pPr>
+        <w:pStyle w:val="ListBullet"/>
+      </w:pPr>
+      <w:r>
+        <w:t>OQ15–OQ18 Railway assistant and animated tutorials: see the dedicated section above for character/presentation, lore, tutorial content/narration, and technically unverified implementation questions.</w:t>
+      </w:r>
+    </w:p>
+    <w:p>
+      <w:pPr>
         <w:pStyle w:val="Heading1"/>
       </w:pPr>
       <w:r>
@@ -600,6 +888,12 @@
     <w:p>
       <w:r>
         <w:t>Version 0.1 created on 14 September 2026. Consolidates the initial concept, detailed balance discussion, user corrections on rail length and tenders, the regional chassis correction, animated servicing requirements and the final conventional rail versus monorail distinction.</w:t>
+      </w:r>
+    </w:p>
+    <w:p>
+      <w:pPr/>
+      <w:r>
+        <w:t>20 September 2026: added the approved Railway Assistant &amp; Animated Tutorial System, preserving the Confirmed / Agreed, Proposed, and Open Questions split; added OQ15–OQ18 without resolving existing questions.</w:t>
       </w:r>
     </w:p>
     <w:p>
@@ -1094,7 +1388,7 @@
       <w:b/>
       <w:bCs/>
       <w:color w:val="000000"/>
-      <w:sz w:val="22"/>
+      <w:sz w:val="26"/>
       <w:szCs w:val="26"/>
     </w:rPr>
   </w:style>
@@ -1114,10 +1408,11 @@
       <w:outlineLvl w:val="2"/>
     </w:pPr>
     <w:rPr>
-      <w:rFonts w:asciiTheme="majorHAnsi" w:eastAsiaTheme="majorEastAsia" w:hAnsiTheme="majorHAnsi" w:cstheme="majorBidi"/>
+      <w:rFonts w:asciiTheme="majorHAnsi" w:eastAsiaTheme="majorEastAsia" w:hAnsiTheme="majorHAnsi" w:cstheme="majorBidi" w:ascii="Calibri" w:hAnsi="Calibri"/>
       <w:b/>
       <w:bCs/>
-      <w:color w:val="4F81BD" w:themeColor="accent1"/>
+      <w:color w:val="000000"/>
+      <w:sz w:val="22"/>
     </w:rPr>
   </w:style>
   <w:style w:type="paragraph" w:styleId="Heading4">

</xml_diff>

<commit_message>
Reconcile expanded design direction and add project roadmap
</commit_message>
<xml_diff>
--- a/Design/Early Locomotion Design Reference.docx
+++ b/Design/Early Locomotion Design Reference.docx
@@ -23,6 +23,7 @@
     <w:p>
       <w:pPr>
         <w:pStyle w:val="Heading1"/>
+        <w:keepNext/>
       </w:pPr>
       <w:r>
         <w:t>Core concept</w:t>
@@ -46,6 +47,7 @@
     <w:p>
       <w:pPr>
         <w:pStyle w:val="Heading1"/>
+        <w:keepNext/>
       </w:pPr>
       <w:r>
         <w:t>Progression</w:t>
@@ -101,6 +103,7 @@
     <w:p>
       <w:pPr>
         <w:pStyle w:val="Heading1"/>
+        <w:keepNext/>
       </w:pPr>
       <w:r>
         <w:t>Track design</w:t>
@@ -129,6 +132,7 @@
     <w:p>
       <w:pPr>
         <w:pStyle w:val="Heading1"/>
+        <w:keepNext/>
       </w:pPr>
       <w:r>
         <w:t>Signalling</w:t>
@@ -157,6 +161,7 @@
     <w:p>
       <w:pPr>
         <w:pStyle w:val="Heading1"/>
+        <w:keepNext/>
       </w:pPr>
       <w:r>
         <w:t>Signal boxes</w:t>
@@ -184,15 +189,50 @@
     </w:p>
     <w:p>
       <w:pPr>
+        <w:pStyle w:val="Heading2"/>
+        <w:keepNext/>
+      </w:pPr>
+      <w:r>
+        <w:t>Mechanical signal-box linkage visuals — Agreed</w:t>
+      </w:r>
+    </w:p>
+    <w:p>
+      <w:pPr/>
+      <w:r>
+        <w:t>Agreed: when a semaphore becomes assigned to or controlled by a signal box, automatically generated mechanical-looking line-side rods/wires/linkages represent that relationship. Where technically practical, they originate from or visibly connect to the controlling box area, follow the railway formation believably, and head toward controlled equipment. They regenerate/update when assignments change. This is primarily a presentation/readability layer; it does not replace automatic territory/control assignment.</w:t>
+      </w:r>
+    </w:p>
+    <w:p>
+      <w:pPr/>
+      <w:r>
+        <w:t>Agreed: players do not manually place, route or wire signalling equipment. There is no manual wiring minigame. Full physical simulation of mechanical rod/cable travel over hundreds of metres is excluded. When controlled equipment changes state, linkage may twitch/jolt/vibrate slightly and appropriate mechanical click/clack/tension audio may play. The semaphore arm, signal-box lever and relevant machine supply the primary readable movement; line-side motion remains secondary environmental detail.</w:t>
+      </w:r>
+    </w:p>
+    <w:p>
+      <w:pPr/>
+      <w:r>
+        <w:t>The design principle is perceptual plausibility, visual communication and mechanical atmosphere, not museum-grade simulation. This builds on mechanical semaphores, limited box capacity/territory, connected-territory assignment and the rod/cable conduit visual language.</w:t>
+      </w:r>
+    </w:p>
+    <w:p>
+      <w:pPr/>
+      <w:r>
+        <w:t>Open Question / technical: rod versus wire appearance, spline/path generation, junction branching, continuity over long runs, overlapping territories, linkage to points/switch equipment, regeneration after track edits or reassignment, clutter, LOD/culling/performance and multiplayer presentation remain unresolved under OQ04. TECHNICAL VERIFICATION NEEDED; no implementation architecture or API is established.</w:t>
+      </w:r>
+    </w:p>
+    <w:p>
+      <w:pPr>
         <w:pStyle w:val="Heading1"/>
+        <w:keepNext/>
       </w:pPr>
       <w:r>
         <w:t>Locomotives</w:t>
       </w:r>
     </w:p>
     <w:p>
+      <w:pPr/>
       <w:r>
-        <w:t>Agreed: Small, Medium and Large are the three initial gameplay classes. They should retain useful roles rather than form a ladder in which every larger engine invalidates the last. Purchase cost, traction, acceleration, speed, supply capacity, consumption and footprint must be considered together.</w:t>
+        <w:t>Agreed: Small, Medium and Large are the three primary Core gameplay roles. Every supported Core regional style ultimately provides one Small, one Medium and one Large locomotive; exact supported launch regions remain open. Each locomotive may have individual statistics. Core simplicity comes from a small roster, broad roles and accessible UX, not identical hidden physics. They should retain useful roles rather than form a ladder in which every larger engine invalidates the last. Purchase cost, traction, acceleration, speed, supply capacity, consumption and footprint must be considered together.</w:t>
       </w:r>
     </w:p>
     <w:p>
@@ -223,49 +263,82 @@
     <w:p>
       <w:pPr>
         <w:pStyle w:val="Heading1"/>
+        <w:keepNext/>
       </w:pPr>
       <w:r>
         <w:t>Regional variants</w:t>
       </w:r>
     </w:p>
     <w:p>
+      <w:pPr>
+        <w:pStyle w:val="Heading2"/>
+        <w:keepNext/>
+      </w:pPr>
       <w:r>
-        <w:t>Agreed ambition: regional models apply to locomotives and wagons. Automatic selection may use the game's language as a default, but players should be able to override it through a Regional Rolling Stock Style option. Language alone does not identify a country or railway preference.</w:t>
+        <w:t>Core regional presentation — Agreed</w:t>
       </w:r>
     </w:p>
     <w:p>
+      <w:pPr/>
       <w:r>
-        <w:t>Suggested style entries include Automatic, British, North American, German or Central European, French and Japanese. This is an example menu, not a committed launch roster. The user is willing to invest in research and modelling; release scope remains open.</w:t>
+        <w:t>Regional presentation is a world/save-level setting, not a per-player visual preference: conflicting infrastructure styles would confuse multiplayer. Normal Core rolling stock follows one regional world style; cross-region mixing is not the normal Core design. Do not duplicate equivalent buildables merely to offer separate British/American/etc. versions of the same freight wagon.</w:t>
       </w:r>
     </w:p>
     <w:p>
+      <w:pPr/>
       <w:r>
-        <w:t>Agreed correction: do not force all regional locomotives onto one physical chassis. Different wheel arrangements, wheelbases, proportions and motion require their own models, rigs and animations. Standardise software behaviour and interfaces instead. The earlier shared collision box and wheel layout proposal must not be treated as a settled requirement.</w:t>
+        <w:t>Changing the selected Core region is intended to affect existing and future Core/basic infrastructure, Core locomotives, Core wagons and other presentation covered by the regional system, not just newly built objects. Runtime implementation is unverified. The earlier language-derived automatic default remains a possible default-selection idea, not a replacement for world/save-level selection.</w:t>
       </w:r>
     </w:p>
     <w:p>
+      <w:pPr/>
       <w:r>
-        <w:t>The user used Big Boy as an extreme illustration of chassis differences, then chose a smaller but still impressive American steam freighter for the ordinary Large role. Big Boy is not the baseline selection. The conversation corrected its wheel arrangement to 4 8 8 4; that correction is background context rather than a gameplay specification.</w:t>
+        <w:t>Each supported Core style ultimately includes one Small, Medium and Large locomotive serving broad roles, with individual definitions/statistics. British, North American and Continental European styles have been discussed repeatedly, but none of these examples establishes the final launch list. Exact launch regions and references remain OQ06.</w:t>
       </w:r>
     </w:p>
     <w:p>
+      <w:pPr/>
       <w:r>
-        <w:t>Later candidate suggestions included a Santa Fe type 2 10 2, a large Mikado 2 8 2, or a heavy 4 8 2 or 2 8 4. No American class has been selected. Regional equivalents should be comparable in role and visual stature, while remaining recognisably distinct.</w:t>
+        <w:t>Agreed architectural constraint: standardise software/data contracts, not physical chassis. Wheel arrangements, wheelbases, proportions, tenders, rigs and animations may differ substantially. The shared collision box/wheel-layout proposal remains Superseded. Big Boy was an illustration of chassis differences, not the ordinary American Large selection. Santa Fe-type 2-10-2, Mikado 2-8-2, heavy 4-8-2 and 2-8-4 suggestions remain unselected examples.</w:t>
       </w:r>
     </w:p>
     <w:p>
+      <w:pPr>
+        <w:pStyle w:val="Heading2"/>
+        <w:keepNext/>
+      </w:pPr>
       <w:r>
-        <w:t>Open balance decision: the accepted initial recommendation used identical statistics within each regional gameplay class. A later assistant proposal allowed different statistics within an equivalent overall performance and cost budget. This later proposal was not confirmed. Use identical class statistics as the earlier baseline pending an explicit decision; do not quietly introduce regional advantages.</w:t>
+        <w:t>Regional performance — Agreed</w:t>
       </w:r>
     </w:p>
     <w:p>
+      <w:pPr/>
       <w:r>
-        <w:t>Specialist or articulated locomotives outside the three class baseline were suggested for distant future expansion. They are not a core launch commitment.</w:t>
+        <w:t>Regional locomotive traditions may have meaningfully different absolute physical/performance characteristics. A North American locomotive may be heavier/more powerful while its corresponding rolling stock is also heavier; a British locomotive may have lower absolute power and lighter stock. These are illustrative principles, not selected classes or numeric specifications.</w:t>
+      </w:r>
+    </w:p>
+    <w:p>
+      <w:pPr/>
+      <w:r>
+        <w:t>The objective is broadly comparable useful gameplay performance for representative regional trains while preserving regional mechanical character, not identical displayed numbers. Wagon tare/mass may be an internal balancing parameter. No numeric balance values or final curves are approved.</w:t>
+      </w:r>
+    </w:p>
+    <w:p>
+      <w:pPr/>
+      <w:r>
+        <w:t>Superseded: the earlier requirement for identical locomotive class statistics between regional variants. It is retained here and in CHANGELOG history only, not as an active requirement.</w:t>
+      </w:r>
+    </w:p>
+    <w:p>
+      <w:pPr/>
+      <w:r>
+        <w:t>Open Question OQ06: whether a world-region change dynamically changes existing locomotive/wagon mass or performance, whether values are fixed at construction, save/load migration, already-running trains, total train mass display, transient/exploit states, coherent migration and visual fallback. Do not choose a migration rule in implementation without approval. TECHNICAL VERIFICATION NEEDED.</w:t>
       </w:r>
     </w:p>
     <w:p>
       <w:pPr>
         <w:pStyle w:val="Heading1"/>
+        <w:keepNext/>
       </w:pPr>
       <w:r>
         <w:t>Fuel and water servicing</w:t>
@@ -294,6 +367,7 @@
     <w:p>
       <w:pPr>
         <w:pStyle w:val="Heading1"/>
+        <w:keepNext/>
       </w:pPr>
       <w:r>
         <w:t>Stations</w:t>
@@ -322,6 +396,7 @@
     <w:p>
       <w:pPr>
         <w:pStyle w:val="Heading1"/>
+        <w:keepNext/>
       </w:pPr>
       <w:r>
         <w:t>Auxiliary tenders</w:t>
@@ -350,6 +425,7 @@
     <w:p>
       <w:pPr>
         <w:pStyle w:val="Heading1"/>
+        <w:keepNext/>
       </w:pPr>
       <w:r>
         <w:t>Service points</w:t>
@@ -378,6 +454,7 @@
     <w:p>
       <w:pPr>
         <w:pStyle w:val="Heading1"/>
+        <w:keepNext/>
       </w:pPr>
       <w:r>
         <w:t>Mk1 to monorail conversion</w:t>
@@ -416,6 +493,7 @@
     <w:p>
       <w:pPr>
         <w:pStyle w:val="Heading1"/>
+        <w:keepNext/>
       </w:pPr>
       <w:r>
         <w:t>Balance philosophy</w:t>
@@ -449,14 +527,16 @@
     <w:p>
       <w:pPr>
         <w:pStyle w:val="Heading1"/>
+        <w:keepNext/>
       </w:pPr>
       <w:r>
         <w:t>Development and asset direction</w:t>
       </w:r>
     </w:p>
     <w:p>
+      <w:pPr/>
       <w:r>
-        <w:t>Proposed architecture: a shared SteamLocomotiveBase owns common fuel, water, traction, steam state, signalling and interface behaviour. Definitions hold performance values; model specific presentation supplies mesh, wheel configuration, rig, animation, steam emitters and audio. Wagon families share common behaviour with cargo, fluid and possible specialist variants.</w:t>
+        <w:t>Agreed design constraint: Core and expansions share expressive locomotive gameplay/simulation with individual definitions; expansions must not delay current Core work. The class/inheritance decision remains unresolved. Proposed architecture: a shared SteamLocomotiveBase owns common fuel, water, traction, steam state, signalling and interface behaviour. Definitions hold performance values; model specific presentation supplies mesh, wheel configuration, rig, animation, steam emitters and audio. Wagon families share common behaviour with cargo, fluid and possible specialist variants.</w:t>
       </w:r>
     </w:p>
     <w:p>
@@ -472,6 +552,7 @@
     <w:p>
       <w:pPr>
         <w:pStyle w:val="Heading1"/>
+        <w:keepNext/>
       </w:pPr>
       <w:r>
         <w:t>Railway Assistant &amp; Animated Tutorial System</w:t>
@@ -480,12 +561,13 @@
     <w:p>
       <w:pPr/>
       <w:r>
-        <w:t>Approved design addition recorded on 20 September 2026, following The Manager's review and the user's explicit approval of the requirements and status split. The groups below distinguish approved behaviour from proposed presentation and unresolved choices.</w:t>
+        <w:t>The 20 September 2026 addition is reconciled with the Manager-approved 1 October dispositions below. Concept approval does not establish API feasibility.</w:t>
       </w:r>
     </w:p>
     <w:p>
       <w:pPr>
         <w:pStyle w:val="Heading2"/>
+        <w:keepNext/>
       </w:pPr>
       <w:r>
         <w:t>Confirmed / Agreed</w:t>
@@ -494,98 +576,55 @@
     <w:p>
       <w:pPr>
         <w:pStyle w:val="Heading3"/>
+        <w:keepNext/>
       </w:pPr>
       <w:r>
-        <w:t>Scripted railway-assistant character</w:t>
+        <w:t>Railway assistant character and scope</w:t>
       </w:r>
     </w:p>
     <w:p>
       <w:pPr/>
       <w:r>
-        <w:t>Early Locomotion has its own scripted, voiced railway-assistant character, distinct from ADA in personality and presentation. She is bubbly, enthusiastic, expressive, noticeably more alive/emotive than ADA, and genuinely eager to help. She is whimsical without becoming random or obnoxiously hyperactive, and competent as an instructor.</w:t>
+        <w:t>Early Locomotion has its own scripted railway-focused assistant, distinct from ADA and voiced by the user/project creator. She is warm, bubbly, enthusiastic, expressive and competent as a teacher, strongly interested in railways, signalling, locomotives and engineering. Her warmer support-oriented presentation contrasts with ADA/FICSIT's colder corporate tone. She handles Early Locomotion narrative/voice presentation and supports integrated railway education.</w:t>
       </w:r>
     </w:p>
     <w:p>
       <w:pPr/>
       <w:r>
-        <w:t>Her enthusiasm centres on railways, railway engineering, signalling, locomotives, and teaching, rather than generic “quirky AI” behaviour. She should feel like an enthusiastic new recruit delighted to finally have a job. The user currently intends to voice her personally, enabling bespoke Early Locomotion guidance without requiring ADA's voice actor. This is a scripted character, not generative/live AI behaviour.</w:t>
+        <w:t>She is not actual generative AI, a live railway-management/diagnostic system, a route calculator, a network inspector, an automatic signal placer or an automatic railway fixer. She does not diagnose or operate the player's live network. Tutorials teach principles and preserve player problem-solving.</w:t>
       </w:r>
     </w:p>
     <w:p>
       <w:pPr>
         <w:pStyle w:val="Heading3"/>
+        <w:keepNext/>
       </w:pPr>
       <w:r>
-        <w:t>First appearance</w:t>
+        <w:t>Animated teaching and reference library</w:t>
       </w:r>
     </w:p>
     <w:p>
       <w:pPr/>
       <w:r>
-        <w:t>The assistant first appears when the player enters Early Locomotion progression: the first applicable Early Locomotion milestone/technology unlock triggers the introduction, whichever qualifying unlock occurs first. The introduction initially resembles the normal Satisfactory/FICSIT/ADA announcement presentation. When ADA would normally appear, the interface appears to glitch or be interrupted/taken over by the railway assistant.</w:t>
+        <w:t>The assistant includes an always-accessible animated railway teaching/reference system. Lessons remain optional and replayable and become available progressively alongside relevant technology. The library remains accessible; individual lessons respect progression. Miniature demonstrations animate concepts, pause at important moments, highlight relevant objects/behaviour and use short explanatory captions. Avoid giant text walls.</w:t>
       </w:r>
     </w:p>
     <w:p>
       <w:pPr/>
       <w:r>
-        <w:t>The sequence is humorous, surprising, and clearly different from ADA, never sinister or horror-themed. She need not claim to have “hacked FICSIT”; the preferred tone is that she takes over and behaves as though this is completely ordinary. Exact presentation details and implementation remain non-canonical until technically verified.</w:t>
+        <w:t>Agreed presentation direction: a clean white miniature model-railway/showroom/IKEA-like table with miniature Early Locomotion trains, track, stations, semaphores, signal boxes and servicing structures. Create's Ponder system may inspire visual interaction, but its assets/presentation must not be copied literally. This is not an implementation dependency.</w:t>
+      </w:r>
+    </w:p>
+    <w:p>
+      <w:pPr/>
+      <w:r>
+        <w:t>Agreed library UI direction: recognisably older FICSIT visual language, instructional, cleaner, older/prototype and less aggressively corporate. This visual direction does not establish historical lore. Desired controls where practical are pause, replay, previous step and next step; exact UI and playback/control implementation remain open under OQ15/OQ18.</w:t>
       </w:r>
     </w:p>
     <w:p>
       <w:pPr>
         <w:pStyle w:val="Heading3"/>
-      </w:pPr>
-      <w:r>
-        <w:t>Teaching purpose and scope</w:t>
-      </w:r>
-    </w:p>
-    <w:p>
-      <w:pPr/>
-      <w:r>
-        <w:t>Her major gameplay function is railway education and Early Locomotion-specific guidance. She may provide bespoke narration/dialogue for appropriate milestones and railway concepts. She teaches principles and leaves railway construction and problem-solving to the player; player agency remains intact.</w:t>
-      </w:r>
-    </w:p>
-    <w:p>
-      <w:pPr/>
-      <w:r>
-        <w:t>She is not a live railway-management system. Explicitly out of scope are inspecting the player's live railway network, analysing current network state, automatically diagnosing signal problems, calculating routes, managing trains, automatically fixing railway designs, automatically placing signals, live railway optimisation, and generative conversational AI.</w:t>
-      </w:r>
-    </w:p>
-    <w:p>
-      <w:pPr>
-        <w:pStyle w:val="Heading3"/>
-      </w:pPr>
-      <w:r>
-        <w:t>Animated tutorials and progressive availability</w:t>
-      </w:r>
-    </w:p>
-    <w:p>
-      <w:pPr/>
-      <w:r>
-        <w:t>Early Locomotion includes an integrated animated railway tutorial/library system. Minecraft Create's Ponder system is an inspiration for the interaction philosophy only, not an implementation dependency or a system to copy directly.</w:t>
-      </w:r>
-    </w:p>
-    <w:p>
-      <w:pPr/>
-      <w:r>
-        <w:t>Animated miniature demonstrations teach visually rather than relying primarily on written documentation. Each demonstration focuses on one railway principle, animates the relevant track/trains/infrastructure, pauses or emphasises important stages, and uses short explanatory captions. Demonstrations remain instructional and do not solve the player's real railway automatically. Scripted pauses/emphasis are distinct from the proposed player playback controls below.</w:t>
-      </w:r>
-    </w:p>
-    <w:p>
-      <w:pPr/>
-      <w:r>
-        <w:t>Tutorial material becomes available alongside the technology/mechanics needed to use it: signalling lessons should not appear before signalling technology exists, and advanced lessons should not precede their corresponding systems. The first railway remains approachable, with operational complexity, signalling, servicing, and advanced railway engineering introduced and taught progressively as they become relevant.</w:t>
-      </w:r>
-    </w:p>
-    <w:p>
-      <w:pPr/>
-      <w:r>
-        <w:t>This feature complements conventional steam infrastructure, progressive railway introduction, simple first routes, increasing signalling complexity, semaphore/block signalling, signal boxes, fuel/water logistics, station/service infrastructure, and operational railway problem-solving.</w:t>
-      </w:r>
-    </w:p>
-    <w:p>
-      <w:pPr>
-        <w:pStyle w:val="Heading3"/>
+        <w:keepNext/>
       </w:pPr>
       <w:r>
         <w:t>Release audio requirement</w:t>
@@ -594,12 +633,13 @@
     <w:p>
       <w:pPr/>
       <w:r>
-        <w:t>The brainstorming reference to the Windows XP startup sound is not an approved release asset. Release audio must use an original, legally distinct retro-computer-style startup jingle unless rights to any third-party copyrighted audio are separately established.</w:t>
+        <w:t>Windows XP audio is not intended release content. Use an original legally distinct retro-computer startup jingle; no third-party sound rights are assumed.</w:t>
       </w:r>
     </w:p>
     <w:p>
       <w:pPr>
         <w:pStyle w:val="Heading2"/>
+        <w:keepNext/>
       </w:pPr>
       <w:r>
         <w:t>Proposed</w:t>
@@ -608,62 +648,52 @@
     <w:p>
       <w:pPr>
         <w:pStyle w:val="Heading3"/>
+        <w:keepNext/>
       </w:pPr>
       <w:r>
-        <w:t>Tutorial presentation</w:t>
+        <w:t>First unlock introduction and apparent ADA takeover</w:t>
       </w:r>
     </w:p>
     <w:p>
       <w:pPr/>
       <w:r>
-        <w:t>A clean white miniature model-railway demonstration table, with IKEA/display-table-like simplicity and miniature Early Locomotion track, locomotives, wagons, stations, signals, and service infrastructure, is a strong current direction rather than a final choice. The presentation would be intentionally clean and instructional.</w:t>
+        <w:t>On the first applicable Early Locomotion technology unlock, expected ADA-style presentation may begin, followed by interface glitches/interference, an apparent railway-assistant takeover, an original retro startup jingle and her introduction. The intended humour is surprising rather than sinister. Exact animation, sequence, dialogue, timing and trigger remain Proposed/Open; no ADA interception or independent recreation mechanism is selected.</w:t>
       </w:r>
     </w:p>
     <w:p>
       <w:pPr>
         <w:pStyle w:val="Heading3"/>
+        <w:keepNext/>
       </w:pPr>
       <w:r>
-        <w:t>Tutorial controls and library UI</w:t>
+        <w:t>Legacy FICSIT flavour</w:t>
       </w:r>
     </w:p>
     <w:p>
       <w:pPr/>
       <w:r>
-        <w:t>Proposed controls, where practical, include pause, replay, and stepping forwards/backwards or staged progression. Their exact scheme and feasibility are not approved. A vertical subject/category list and logical subject grouping are proposed library layout choices. That layout would expose progressive availability based on unlock state; progressive tutorial availability itself is Agreed above.</w:t>
+        <w:t>Older UI language, warmer support tone, obsolete/prototype styling, less productivity-obsessed wording and strange persistence in the modern system may imply an earlier FICSIT era. Do not canonise “FICSIT used to be good and was later corrupted.” Exact historical origin remains open.</w:t>
       </w:r>
     </w:p>
     <w:p>
       <w:pPr>
         <w:pStyle w:val="Heading3"/>
+        <w:keepNext/>
       </w:pPr>
       <w:r>
-        <w:t>Visual language and possible lore implication</w:t>
+        <w:t>Expanded teaching and character content</w:t>
       </w:r>
     </w:p>
     <w:p>
       <w:pPr/>
       <w:r>
-        <w:t>The proposed UI is recognisably FICSIT-derived but appears older than current FICSIT UI: cleaner, more instructional, less aggressively corporate/efficiency-focused, and archival/prototype in character. It may imply that the assistant belongs to or originated from an earlier FICSIT era. That implication is not confirmed lore.</w:t>
-      </w:r>
-    </w:p>
-    <w:p>
-      <w:pPr>
-        <w:pStyle w:val="Heading3"/>
-      </w:pPr>
-      <w:r>
-        <w:t>Expanded content</w:t>
-      </w:r>
-    </w:p>
-    <w:p>
-      <w:pPr/>
-      <w:r>
-        <w:t>Later/proposed possibilities include specialised railway lessons, common-mistakes demonstrations, additional character flavour dialogue/animations, a larger tutorial catalogue, advanced junction/passing-loop/signalling demonstrations, and additional milestone narration structure. No launch tutorial roster is defined by this approval.</w:t>
+        <w:t>Specialised/common-mistakes lessons, advanced junction/passing-loop/signalling demonstrations, additional flavour dialogue/animations and milestone narration remain Proposed beyond the concept. A vertical subject/category list is one Proposed layout, not the final library UI.</w:t>
       </w:r>
     </w:p>
     <w:p>
       <w:pPr>
         <w:pStyle w:val="Heading2"/>
+        <w:keepNext/>
       </w:pPr>
       <w:r>
         <w:t>Open Questions</w:t>
@@ -673,85 +703,290 @@
       <w:pPr>
         <w:pStyle w:val="ListBullet"/>
       </w:pPr>
-      <w:r/>
       <w:r>
-        <w:rPr>
-          <w:b/>
-        </w:rPr>
-        <w:t>OQ15 — Character and presentation:</w:t>
-      </w:r>
-      <w:r>
-        <w:t xml:space="preserve"> What is the assistant's final name? What is the exact introductory dialogue? What avatar/visual character design, if any, and colour palette should be used? What is the final library/interface layout?</w:t>
+        <w:t>OQ15 — Character and presentation: Exact assistant name, introductory dialogue, avatar/visual design, palette and final library/UI layout remain open.</w:t>
       </w:r>
     </w:p>
     <w:p>
       <w:pPr>
         <w:pStyle w:val="ListBullet"/>
       </w:pPr>
-      <w:r/>
       <w:r>
-        <w:rPr>
-          <w:b/>
-        </w:rPr>
-        <w:t>OQ16 — Historical origin and lore:</w:t>
-      </w:r>
-      <w:r>
-        <w:t xml:space="preserve"> Is her historical origin ever explicitly explained? Does the older-FICSIT presentation represent real project lore or remain visual implication only?</w:t>
+        <w:t>OQ16 — Historical origin and lore: Exact deeper lore/origin; whether history is explained or implied, and whether older-FICSIT styling represents lore or visual implication only.</w:t>
       </w:r>
     </w:p>
     <w:p>
       <w:pPr>
         <w:pStyle w:val="ListBullet"/>
       </w:pPr>
-      <w:r/>
       <w:r>
-        <w:rPr>
-          <w:b/>
-        </w:rPr>
-        <w:t>OQ17 — Tutorial content and narration:</w:t>
-      </w:r>
-      <w:r>
-        <w:t xml:space="preserve"> What is the exact launch tutorial roster? Which technology/unlock grants each tutorial? What is the exact milestone voice-line structure?</w:t>
+        <w:t>OQ17 — Tutorial content and narration: Exact subject/launch roster, unlock mapping and milestone voice-line structure.</w:t>
       </w:r>
     </w:p>
     <w:p>
       <w:pPr>
         <w:pStyle w:val="ListBullet"/>
       </w:pPr>
-      <w:r/>
       <w:r>
-        <w:rPr>
-          <w:b/>
-        </w:rPr>
-        <w:t>OQ18 — Tutorial and assistant implementation:</w:t>
-      </w:r>
-      <w:r>
-        <w:t xml:space="preserve"> What are the exact playback controls and first-unlock trigger implementation? How is the ADA-style takeover/presentation implemented? Should it imitate/intercept vanilla ADA presentation or recreate the effect independently? How are animated miniature demonstrations, progressive tutorial unlock tracking, and voice/audio integration implemented? Each implementation-related choice requires technical verification against the real Satisfactory/SML/Unreal environment.</w:t>
+        <w:t>OQ18 — Tutorial and assistant implementation: Exact playback controls, first-unlock trigger, announcement UI, ADA-style illusion/interception versus independent recreation, animated demonstration scenes, lesson tracking and voice/audio integration. TECHNICAL VERIFICATION NEEDED against the actual environment; no API, hook, Blueprint or architecture is approved.</w:t>
       </w:r>
     </w:p>
     <w:p>
       <w:pPr>
-        <w:pStyle w:val="Heading3"/>
+        <w:pStyle w:val="Heading1"/>
+        <w:keepNext/>
       </w:pPr>
       <w:r>
-        <w:t>Technical verification required</w:t>
+        <w:t>Build menu UX</w:t>
       </w:r>
     </w:p>
     <w:p>
       <w:pPr/>
       <w:r>
-        <w:t>The following capabilities remain unverified: intercepting or recreating ADA-style announcement presentation; triggering the introduction exactly once; custom tutorial/library UI; animated miniature demonstrations; progressive tutorial unlock tracking; pause/replay/step functionality; and custom voice/audio integration.</w:t>
+        <w:t>Proposed: Early Locomotion eventually has its own top-level build category rather than placing the entire system in vanilla Transport. Possible groups are Railway Infrastructure, Stations / Servicing, Signalling and Rolling Stock. Exact hierarchy/nesting remains OQ19. TECHNICAL VERIFICATION NEEDED for Satisfactory build-menu support; no API or implementation is established.</w:t>
+      </w:r>
+    </w:p>
+    <w:p>
+      <w:pPr>
+        <w:pStyle w:val="Heading1"/>
+        <w:keepNext/>
+      </w:pPr>
+      <w:r>
+        <w:t>Post-release enthusiast expansion programme</w:t>
+      </w:r>
+    </w:p>
+    <w:p>
+      <w:pPr>
+        <w:pStyle w:val="Heading2"/>
+        <w:keepNext/>
+      </w:pPr>
+      <w:r>
+        <w:t>Core boundary and shared foundation — Agreed</w:t>
       </w:r>
     </w:p>
     <w:p>
       <w:pPr/>
       <w:r>
-        <w:t>Investigate whether the desired “ADA takeover” illusion can be reproduced independently instead of modifying/intercepting ADA's actual presentation system. This may be safer for compatibility, but no implementation decision has been made. No APIs, class names, hooks, Blueprints, or implementation architecture are specified by this design approval.</w:t>
+        <w:t>The expansion programme is a Proposed long-term post-Core direction. Agreed constraint: it must not delay Core, first playable implementation or Core 1.0. Core must be complete, polished and satisfying; do not deliberately weaken or leave Core locomotives incomplete to sell expansions. Core retains its identity as Satisfactory with a distinct early steam railway system. Expansion value would come from breadth, historical variety, specialisation, enthusiast depth, advanced operation and infrastructure.</w:t>
+      </w:r>
+    </w:p>
+    <w:p>
+      <w:pPr/>
+      <w:r>
+        <w:t>Agreed: Core and expansion locomotives share one sufficiently expressive underlying gameplay/simulation foundation, with individual data-driven definitions. Expansions add definitions, nuanced characteristics and optional deeper driving interactions. Do not create an expansion-only physics engine where the common foundation can support both. Standardise software/data contracts, not physical locomotive chassis. This is a design constraint, not a choice of Unreal inheritance or implementation type.</w:t>
+      </w:r>
+    </w:p>
+    <w:p>
+      <w:pPr>
+        <w:pStyle w:val="Heading2"/>
+        <w:keepNext/>
+      </w:pPr>
+      <w:r>
+        <w:t>Regional packs and updates — Proposed</w:t>
+      </w:r>
+    </w:p>
+    <w:p>
+      <w:pPr/>
+      <w:r>
+        <w:t>Separate regional enthusiast packs may add expanded fleets, region-specific advanced infrastructure presentation, enthusiast systems and historical/livery content. Approximately £10 GBP per pack is a Proposed planning target only; exact price is open. Pricing, storefront, entitlement, distribution and commercial permission are not technically or legally settled.</w:t>
+      </w:r>
+    </w:p>
+    <w:p>
+      <w:pPr/>
+      <w:r>
+        <w:t>Proposed update model: launch with a smaller meaningful roster, then add locomotives/content through updates supplied to existing owners without charging per locomotive. Exact roster and release strategy remain open. Do not canonise early adopters paying more for incomplete content; early-access pricing remains open.</w:t>
+      </w:r>
+    </w:p>
+    <w:p>
+      <w:pPr>
+        <w:pStyle w:val="Heading2"/>
+        <w:keepNext/>
+      </w:pPr>
+      <w:r>
+        <w:t>Expanded locomotive catalogue — Agreed direction</w:t>
+      </w:r>
+    </w:p>
+    <w:p>
+      <w:pPr/>
+      <w:r>
+        <w:t>Without expansions, Small / Medium / Large remains the simple primary Core selection. With a substantially expanded enthusiast roster, browsing should move to historical/operational role categories. Core locomotives remain available and are reclassified into that catalogue. Shunters, Mixed Traffic, Express Freight / Fast Freight and Heavy Freight are candidate names only. A category explains a locomotive family/role; its individual card explains that machine's strengths and duties. Exact category names remain open.</w:t>
+      </w:r>
+    </w:p>
+    <w:p>
+      <w:pPr/>
+      <w:r>
+        <w:t>Satisfactory has no normal passenger economy. A gameplay Express category primarily means express/fast freight or high-speed logistics, not a passenger-service requirement. Passenger-oriented historical classes may appear for broader real-world use, enthusiast significance or cameo/prestige content. Historical descriptions must state their real purpose honestly even if gameplay adapts it.</w:t>
+      </w:r>
+    </w:p>
+    <w:p>
+      <w:pPr/>
+      <w:r>
+        <w:t>Each expansion locomotive may meaningfully differ in tractive effort, speed, mass, acceleration, braking, coal/water capacity and consumption, gradient behaviour and hauling character. They are not cosmetic skins of Small/Medium/Large; same-category locomotives need not behave identically. No final values are approved. Real railway research informs relative character, role, identity and plausible differences; do not copy all engineering values literally into Satisfactory. The aim is historically knowledgeable gameplay, not exact engineering simulation.</w:t>
+      </w:r>
+    </w:p>
+    <w:p>
+      <w:pPr/>
+      <w:r>
+        <w:t>Agreed: the eventual roster has a deliberate cap to avoid overwhelming players. Substantial variety is a Proposed aspiration; earlier examples of roughly four shunters, five–six mixed-traffic and up to ten each fast/heavy freight machines are not committed counts or requirements. Exact expansion names, roster, count and role categories remain OQ20.</w:t>
+      </w:r>
+    </w:p>
+    <w:p>
+      <w:pPr>
+        <w:pStyle w:val="Heading2"/>
+        <w:keepNext/>
+      </w:pPr>
+      <w:r>
+        <w:t>Historical cards and Golden Era scope</w:t>
+      </w:r>
+    </w:p>
+    <w:p>
+      <w:pPr/>
+      <w:r>
+        <w:t>Agreed: expansion locomotive cards separate HISTORY / CHARACTER from EARLY LOCOMOTION GAMEPLAY. History gives a short researched introduction covering class, designer/builder/operator, introduction era/year, intended historical purpose and useful reputation/story. Gameplay states duties, strengths, weaknesses and practical role. Research class-specific history when developing rosters; no roster is approved here.</w:t>
+      </w:r>
+    </w:p>
+    <w:p>
+      <w:pPr/>
+      <w:r>
+        <w:t>Proposed: regional fleets primarily draw from steam's mature/Golden Era period. British examples may include suitable GWR, LNER, LMS, SR, British Railways and other relevant operators. Operators inform history, livery and identity; they are not build-menu categories. Exact chronological boundaries remain OQ21.</w:t>
+      </w:r>
+    </w:p>
+    <w:p>
+      <w:pPr>
+        <w:pStyle w:val="Heading2"/>
+        <w:keepNext/>
+      </w:pPr>
+      <w:r>
+        <w:t>Late steam and advanced infrastructure</w:t>
+      </w:r>
+    </w:p>
+    <w:p>
+      <w:pPr/>
+      <w:r>
+        <w:t>Agreed: vanilla electric monorail remains technically superior overall even with expansions. High-end steam may remain late-game viable in specialised roles through physical scale: large terminals, many tracks/trains, substantial signalling/servicing and large railway complexes. Electric remains compact, efficient, convenient and high-density; steam's scale/volume ambition does not make it objectively better.</w:t>
+      </w:r>
+    </w:p>
+    <w:p>
+      <w:pPr/>
+      <w:r>
+        <w:t>Agreed: advanced late-game steam infrastructure is expansion-only and serves enthusiasts intentionally retaining steam after electric unlocks. Larger terminals, higher-capacity servicing, larger signal boxes/capacity/territories, improved interlocking, greater practical signal spacing and large-network systems remain Proposed/Open. Do not give steam vanilla electronic capability with semaphore visuals. Exact catalogue remains OQ22.</w:t>
+      </w:r>
+    </w:p>
+    <w:p>
+      <w:pPr/>
+      <w:r>
+        <w:t>Proposed regional asset direction: Core provides BASIC regional infrastructure presentation; matching regional packs provide ADVANCED expansion presentation. Owned matching assets may supply the selected visual set; unowned regional assets must not be provided magically. Fallback for existing advanced infrastructure when a matching pack is unavailable remains OQ23.</w:t>
+      </w:r>
+    </w:p>
+    <w:p>
+      <w:pPr>
+        <w:pStyle w:val="Heading2"/>
+        <w:keepNext/>
+      </w:pPr>
+      <w:r>
+        <w:t>Expansion locomotive region switching — Open Question</w:t>
+      </w:r>
+    </w:p>
+    <w:p>
+      <w:pPr/>
+      <w:r>
+        <w:t>OQ23 includes a British expansion-exclusive locomotive remaining in a save after switching world style to North American without owning that pack. No transformation mapping, fallback machine, restriction or retention rule is selected. With multiple packs, whether machines transform into equivalent regional classes is also open. Do not force identical roster structures to enable mapping.</w:t>
+      </w:r>
+    </w:p>
+    <w:p>
+      <w:pPr>
+        <w:pStyle w:val="Heading2"/>
+        <w:keepNext/>
+      </w:pPr>
+      <w:r>
+        <w:t>Advanced manual driving</w:t>
+      </w:r>
+    </w:p>
+    <w:p>
+      <w:pPr/>
+      <w:r>
+        <w:t>Agreed direction: advanced manual steam driving is an optional/toggleable enthusiast expansion feature. Normal Simple controls remain available and are the default. First relevant expansion use/launch presents SIMPLE CONTROLS versus ADVANCED STEAM CONTROLS, with Simple preselected and clear notice that the choice can change later. The assistant may present the choice. SML/SMM configuration implementation remains unverified.</w:t>
+      </w:r>
+    </w:p>
+    <w:p>
+      <w:pPr/>
+      <w:r>
+        <w:t>Proposed exploration: reverser/cutoff, regulator/throttle, locomotive brake, firing/firebox, steam pressure and possibly boiler water/injectors. A conceptual loop links fire/heat/water, steam/pressure, regulator consumption, cutoff tradeoffs and anticipating gradients/heavy starts; it is not an approved final physics model. Boiler water, injectors, firing depth, pressure limits, reverser modelling, failure consequences and stall/performance penalties remain OQ24. Catastrophic boiler explosions/damage are not an approved requirement.</w:t>
+      </w:r>
+    </w:p>
+    <w:p>
+      <w:pPr/>
+      <w:r>
+        <w:t>Proposed/Open: Simple could behave as a competent automatic crew managing complex steam systems; skilful Advanced operation might provide engagement and possibly modest efficiency/performance benefits. Do not make Simple deliberately bad to force Advanced. The performance relationship remains OQ24.</w:t>
+      </w:r>
+    </w:p>
+    <w:p>
+      <w:pPr>
+        <w:pStyle w:val="Heading2"/>
+        <w:keepNext/>
+      </w:pPr>
+      <w:r>
+        <w:t>Liveries and cameo content</w:t>
+      </w:r>
+    </w:p>
+    <w:p>
+      <w:pPr/>
+      <w:r>
+        <w:t>Agreed expansion principle: historical liveries are prominent, with an appropriate/default historical presentation where feasible and possible additional historical liveries. FICSIT/custom corporate styles remain possible. Historical liveries must not become separate real-money microtransactions within an owned expansion proposal. Customizer/AWESOME Shop integration is Proposed and technically unverified; exact livery integration and relevant licensing remain OQ25.</w:t>
+      </w:r>
+    </w:p>
+    <w:p>
+      <w:pPr/>
+      <w:r>
+        <w:t>Proposed flavour: occasional, first-time/context-sensitive, non-spammy assistant reactions may express railway-nerd pleasure at historical liveries and playful disappointment at corporate/FICSIT styling. Exact dialogue remains future writing work.</w:t>
+      </w:r>
+    </w:p>
+    <w:p>
+      <w:pPr/>
+      <w:r>
+        <w:t>Proposed: famous locomotives may be special enthusiast, prestige/cameo additions or AWESOME Shop-style unlocks within an owned pack where appropriate. Flying Scotsman and Mallard are examples only; no cameo roster is approved. Names, trademarks, liveries and licensing require verification before commercial release (OQ25).</w:t>
+      </w:r>
+    </w:p>
+    <w:p>
+      <w:pPr>
+        <w:pStyle w:val="Heading2"/>
+        <w:keepNext/>
+      </w:pPr>
+      <w:r>
+        <w:t>Multiplayer and compatibility</w:t>
+      </w:r>
+    </w:p>
+    <w:p>
+      <w:pPr/>
+      <w:r>
+        <w:t>Agreed desired outcome: friends should ideally not need a separate enthusiast-content purchase simply to join/play with an owner, if technically, legally and commercially viable. This is not verified server-side DLC. Client installation/asset requirements and commercial entitlement are distinct. Client assets, mod loading, server dependencies, entitlement, save compatibility and differing pack availability remain OQ27.</w:t>
+      </w:r>
+    </w:p>
+    <w:p>
+      <w:pPr/>
+      <w:r>
+        <w:t>Agreed: regional packs depend on Core, should coexist and be mutually compatible. Multiple packs should not duplicate underlying mechanical systems. Share gameplay systems/data contracts where practical and vary content/presentation; different regional buildings do not justify separate gameplay implementations.</w:t>
+      </w:r>
+    </w:p>
+    <w:p>
+      <w:pPr>
+        <w:pStyle w:val="Heading2"/>
+        <w:keepNext/>
+      </w:pPr>
+      <w:r>
+        <w:t>Commercial delivery — Open Question</w:t>
+      </w:r>
+    </w:p>
+    <w:p>
+      <w:pPr/>
+      <w:r>
+        <w:t>Exact pack pricing, early-access pricing, paid distribution/storefront and commercial/platform permission remain OQ26. Patreon, external purchases and manual installation are unapproved ideas, not implementation plans. Investigation must cover Coffee Stain and Satisfactory Modding policies, SML/SMR rules, redistribution, commercial permissions, platform terms, entitlement, updates, dependencies and licensing. TECHNICAL VERIFICATION NEEDED, plus legal/commercial verification; no promise of sale or distribution mechanism is established.</w:t>
       </w:r>
     </w:p>
     <w:p>
       <w:pPr>
         <w:pStyle w:val="Heading1"/>
+        <w:keepNext/>
       </w:pPr>
       <w:r>
         <w:t>Open questions</w:t>
@@ -786,7 +1021,7 @@
         <w:pStyle w:val="ListBullet"/>
       </w:pPr>
       <w:r>
-        <w:t>OQ04 Signal boxes: settle capacity, territory measurement, overlap and reassignment rules.</w:t>
+        <w:t>OQ04 Signal boxes: settle capacity, territory measurement, overlap and reassignment; generated linkage appearance, routing/branching, continuity, equipment coverage including points, regeneration, clutter, LOD/performance and multiplayer presentation.</w:t>
       </w:r>
     </w:p>
     <w:p>
@@ -802,7 +1037,7 @@
         <w:pStyle w:val="ListBullet"/>
       </w:pPr>
       <w:r>
-        <w:t>OQ06 Regions: select launch packs, American references, fallback style and identical statistics versus regional tradeoffs; define multiplayer selection and save behaviour.</w:t>
+        <w:t>OQ06 Regions: select exact supported Core launch regions and references; specify world/save selection and existing/future presentation switching, fallback, save/load migration, dynamic versus construction-fixed mass/performance, already-running trains, total train mass display, transient/exploit states and coherent migration. Identical class statistics are Superseded; regional balance values remain unset.</w:t>
       </w:r>
     </w:p>
     <w:p>
@@ -858,7 +1093,7 @@
         <w:pStyle w:val="ListBullet"/>
       </w:pPr>
       <w:r>
-        <w:t>OQ13 Scope: decide whether interchange buildings, specialist engines and faster servicing equipment belong in later releases.</w:t>
+        <w:t>OQ13 Scope: determine Core/post-launch non-expansion scope for interchange buildings and specialist content. Advanced late-game steam infrastructure belongs to expansions; its exact catalogue remains OQ22.</w:t>
       </w:r>
     </w:p>
     <w:p>
@@ -879,7 +1114,80 @@
     </w:p>
     <w:p>
       <w:pPr>
+        <w:pStyle w:val="ListBullet"/>
+      </w:pPr>
+      <w:r>
+        <w:t>OQ19 Build menu: verify top-level category support and select exact hierarchy/nesting.</w:t>
+      </w:r>
+    </w:p>
+    <w:p>
+      <w:pPr>
+        <w:pStyle w:val="ListBullet"/>
+      </w:pPr>
+      <w:r>
+        <w:t>OQ20 Expansion catalogue: exact pack names, release/update roster and strategy, deliberate total cap and historical/operational role-category names. No suggested counts are commitments.</w:t>
+      </w:r>
+    </w:p>
+    <w:p>
+      <w:pPr>
+        <w:pStyle w:val="ListBullet"/>
+      </w:pPr>
+      <w:r>
+        <w:t>OQ21 Golden Era: exact chronological start/end and regional/operator coverage.</w:t>
+      </w:r>
+    </w:p>
+    <w:p>
+      <w:pPr>
+        <w:pStyle w:val="ListBullet"/>
+      </w:pPr>
+      <w:r>
+        <w:t>OQ22 Advanced infrastructure: exact expansion-only catalogue, capabilities, capacity/territory/interlocking limits and balancing against electric superiority.</w:t>
+      </w:r>
+    </w:p>
+    <w:p>
+      <w:pPr>
+        <w:pStyle w:val="ListBullet"/>
+      </w:pPr>
+      <w:r>
+        <w:t>OQ23 Expansion regional migration: expansion-only locomotive handling across world-region switches with missing/multiple packs; advanced regional-asset fallback; no mapping, retention, restriction or fallback rule selected.</w:t>
+      </w:r>
+    </w:p>
+    <w:p>
+      <w:pPr>
+        <w:pStyle w:val="ListBullet"/>
+      </w:pPr>
+      <w:r>
+        <w:t>OQ24 Advanced driving: exact simulation depth, boiler water/injectors, firing, pressure limits, reverser, failures/stalls and Simple-versus-Advanced performance. Configuration and input implementation require verification.</w:t>
+      </w:r>
+    </w:p>
+    <w:p>
+      <w:pPr>
+        <w:pStyle w:val="ListBullet"/>
+      </w:pPr>
+      <w:r>
+        <w:t>OQ25 Liveries and cameos: exact livery integration, Customizer/AWESOME support, cameo roster and name/trademark/livery licensing.</w:t>
+      </w:r>
+    </w:p>
+    <w:p>
+      <w:pPr>
+        <w:pStyle w:val="ListBullet"/>
+      </w:pPr>
+      <w:r>
+        <w:t>OQ26 Commercial programme: exact regional pack price, early-access pricing, paid distribution/storefront, permissions/policies, redistribution, updates/dependencies and licensing. No delivery plan approved.</w:t>
+      </w:r>
+    </w:p>
+    <w:p>
+      <w:pPr>
+        <w:pStyle w:val="ListBullet"/>
+      </w:pPr>
+      <w:r>
+        <w:t>OQ27 Multiplayer expansions: client assets/install/mod loading, server dependencies, entitlement, save compatibility, differing pack availability and feasibility of the join-without-extra-purchase goal.</w:t>
+      </w:r>
+    </w:p>
+    <w:p>
+      <w:pPr>
         <w:pStyle w:val="Heading1"/>
+        <w:keepNext/>
       </w:pPr>
       <w:r>
         <w:t>Revision record</w:t>
@@ -894,6 +1202,12 @@
       <w:pPr/>
       <w:r>
         <w:t>20 September 2026: added the approved Railway Assistant &amp; Animated Tutorial System, preserving the Confirmed / Agreed, Proposed, and Open Questions split; added OQ15–OQ18 without resolving existing questions.</w:t>
+      </w:r>
+    </w:p>
+    <w:p>
+      <w:pPr/>
+      <w:r>
+        <w:t>1 October 2026: reconciled Manager-approved assistant/tutorial, generated linkage, world-region and regional-performance direction; identical regional statistics are Superseded. Added a clearly post-Core Proposed enthusiast programme, agreed scope/foundation/compatibility constraints, OQ19–OQ27 and revised OQ04/OQ06/OQ13/OQ15–OQ18. No implementation or remaining Open Question is resolved.</w:t>
       </w:r>
     </w:p>
     <w:p>

</xml_diff>

<commit_message>
Refine locomotive identity numbering and expansion systems
</commit_message>
<xml_diff>
--- a/Design/Early Locomotion Design Reference.docx
+++ b/Design/Early Locomotion Design Reference.docx
@@ -30,6 +30,9 @@
       </w:r>
     </w:p>
     <w:p>
+      <w:pPr>
+        <w:keepLines/>
+      </w:pPr>
       <w:r>
         <w:t>The mod is called Satisfactory Early Locomotion. Its core railway uses conventional two rail track, steam locomotives and period inspired infrastructure. A broad selection of locomotive and wagon variants is part of the long term ambition.</w:t>
       </w:r>
@@ -54,6 +57,9 @@
       </w:r>
     </w:p>
     <w:p>
+      <w:pPr>
+        <w:keepLines/>
+      </w:pPr>
       <w:r>
         <w:t>Agreed direction: introduce the railway progressively and preserve electric rail's superior role in a mature factory. A simple first route should work without demanding extensive signalling expertise. More vehicles, junctions and throughput should create the need for more infrastructure.</w:t>
       </w:r>
@@ -110,6 +116,9 @@
       </w:r>
     </w:p>
     <w:p>
+      <w:pPr>
+        <w:keepLines/>
+      </w:pPr>
       <w:r>
         <w:t>Agreed: early rails use Iron Plates and Iron Rods. They look like conventional railway track, with two thin steel rails held together by transverse beams or sleepers. Both locomotives and wagons are cheaper than their vanilla equivalents; exact recipes are not yet set.</w:t>
       </w:r>
@@ -139,6 +148,9 @@
       </w:r>
     </w:p>
     <w:p>
+      <w:pPr>
+        <w:keepLines/>
+      </w:pPr>
       <w:r>
         <w:t>Agreed: semaphores divide the railway into blocks with a maximum permitted block length. Additional signals are required along longer lines. Early signalling also imposes a maximum operating speed. Signals must belong to a signal box with limited control capacity.</w:t>
       </w:r>
@@ -168,6 +180,9 @@
       </w:r>
     </w:p>
     <w:p>
+      <w:pPr>
+        <w:keepLines/>
+      </w:pPr>
       <w:r>
         <w:t>Agreed: each steam station includes a signal box. Dedicated boxes extend control as the network grows, so a new player does not need extra standalone control buildings merely to start a basic route.</w:t>
       </w:r>
@@ -197,7 +212,9 @@
       </w:r>
     </w:p>
     <w:p>
-      <w:pPr/>
+      <w:pPr>
+        <w:keepLines/>
+      </w:pPr>
       <w:r>
         <w:t>Agreed: when a semaphore becomes assigned to or controlled by a signal box, automatically generated mechanical-looking line-side rods/wires/linkages represent that relationship. Where technically practical, they originate from or visibly connect to the controlling box area, follow the railway formation believably, and head toward controlled equipment. They regenerate/update when assignments change. This is primarily a presentation/readability layer; it does not replace automatic territory/control assignment.</w:t>
       </w:r>
@@ -230,7 +247,9 @@
       </w:r>
     </w:p>
     <w:p>
-      <w:pPr/>
+      <w:pPr>
+        <w:keepLines/>
+      </w:pPr>
       <w:r>
         <w:t>Agreed: Small, Medium and Large are the three primary Core gameplay roles. Every supported Core regional style ultimately provides one Small, one Medium and one Large locomotive; exact supported launch regions remain open. Each locomotive may have individual statistics. Core simplicity comes from a small roster, broad roles and accessible UX, not identical hidden physics. They should retain useful roles rather than form a ladder in which every larger engine invalidates the last. Purchase cost, traction, acceleration, speed, supply capacity, consumption and footprint must be considered together.</w:t>
       </w:r>
@@ -266,6 +285,176 @@
         <w:keepNext/>
       </w:pPr>
       <w:r>
+        <w:t>Locomotive identity and running numbers — Core feature</w:t>
+      </w:r>
+    </w:p>
+    <w:p>
+      <w:pPr>
+        <w:pStyle w:val="Heading2"/>
+        <w:keepNext/>
+      </w:pPr>
+      <w:r>
+        <w:t>Normal locomotives and permanent Fleet Identity — Agreed</w:t>
+      </w:r>
+    </w:p>
+    <w:p>
+      <w:pPr>
+        <w:keepLines/>
+      </w:pPr>
+      <w:r>
+        <w:t>Visible running numbers are a Core feature for both Core and expansion normal locomotives. Normal locomotives represent class members, receive generated historically plausible numbers and normally have no individual names. A number is assigned after successful placement; the build hologram does not need a permanent final number. The lifecycle hook/event remains TECHNICAL VERIFICATION NEEDED.</w:t>
+      </w:r>
+    </w:p>
+    <w:p>
+      <w:pPr/>
+      <w:r>
+        <w:t>Every normal locomotive receives a permanent hidden Fleet Identity, distinct from its visible running number. It survives repainting, livery changes, regional transformations and renumbering. Dismantling/deletion destroys that identity; a new placement receives a new identity. Exact persistence/storage remains OQ28. The word registry/database does not require SQL or an external database.</w:t>
+      </w:r>
+    </w:p>
+    <w:p>
+      <w:pPr>
+        <w:pStyle w:val="Heading2"/>
+        <w:keepNext/>
+      </w:pPr>
+      <w:r>
+        <w:t>Regional number mappings — Agreed</w:t>
+      </w:r>
+    </w:p>
+    <w:p>
+      <w:pPr>
+        <w:keepLines/>
+      </w:pPr>
+      <w:r>
+        <w:t>One Fleet Identity may store separate visible-number mappings for its regional identities. British → North American → British restores the previous British number rather than generating a fresh one each round trip. Manual renumbering within a region updates that region's stored mapping: a player changing 47298 to 47111 returns to Britain with 47111. These numbers illustrate persistence, not verified class-number datasets.</w:t>
+      </w:r>
+    </w:p>
+    <w:p>
+      <w:pPr/>
+      <w:r>
+        <w:t>A genuine Core regional transformation uses the destination region's stored/generated number and retains Fleet Identity and previous mappings. If an expansion locomotive cannot transform because no valid corresponding owned destination locomotive is available, it retains its existing regional identity, presentation and number; no new destination number is allocated. Livery changes alone never assign a new number. Explicit numbering-mode changes, region/class transformations and manual renumbering are number-change events; their technical implementation remains open.</w:t>
+      </w:r>
+    </w:p>
+    <w:p>
+      <w:pPr>
+        <w:pStyle w:val="Heading2"/>
+        <w:keepNext/>
+      </w:pPr>
+      <w:r>
+        <w:t>World numbering modes — Agreed</w:t>
+      </w:r>
+    </w:p>
+    <w:p>
+      <w:pPr>
+        <w:keepLines/>
+      </w:pPr>
+      <w:r>
+        <w:t>Core provides a world-level choice between Standardised and Historical Operator numbering. Standardised uses a consistent later/common scheme appropriate to that region; BR-style standardisation is a likely British reference baseline, not an approved dataset. Historical Operator uses researched operator/class-specific rules; GWR, LMS, LNER, Southern and BR are British examples, not complete data. The setting affects eligible locomotives across the world, rather than giving each normal engine an independent regime by default. The railway assistant should explain the choice when introduced; exact dialogue remains future writing work.</w:t>
+      </w:r>
+    </w:p>
+    <w:p>
+      <w:pPr/>
+      <w:r>
+        <w:t>Changing mode alters only system-controlled/class-specific structure as required and preserves player-selected digits wherever valid. If a destination scheme cannot support the prior structure, adjust/remove incompatible scheme-controlled structure while preserving user-controlled content where possible. A controlled portion need not literally be a prefix. The system must protect class/scheme structure. Exact conversions and datasets remain OQ29.</w:t>
+      </w:r>
+    </w:p>
+    <w:p>
+      <w:pPr>
+        <w:pStyle w:val="Heading2"/>
+        <w:keepNext/>
+      </w:pPr>
+      <w:r>
+        <w:t>Unique allocation, release and overflow — Agreed</w:t>
+      </w:r>
+    </w:p>
+    <w:p>
+      <w:pPr>
+        <w:keepLines/>
+      </w:pPr>
+      <w:r>
+        <w:t>Normal numbers must be historically plausible, not one-to-one recreations of real individual machines. Generation follows researched class blocks, operator ranges, controlled portions, formats and meaningful ordering rules. Produce a valid candidate, check the active registry, reject/retry a reserved candidate and reserve a valid number. Two active normal locomotives cannot share a visible number in the relevant numbering pool/domain; whether that domain is class, operator, region or a broader scheme remains OQ29.</w:t>
+      </w:r>
+    </w:p>
+    <w:p>
+      <w:pPr/>
+      <w:r>
+        <w:t>Dismantling/deletion releases the active reservation, allowing later reuse; the save does not permanently retire every allocated number. Exhausting a plausible historical pool must not block placement: use explicit, unique, visibly non-historical overflow allocation. X-00001 / X-00002 are examples only; the final prefix/format remains open.</w:t>
+      </w:r>
+    </w:p>
+    <w:p>
+      <w:pPr/>
+      <w:r>
+        <w:t>Construction order, a save-local sequence or another internal ordering mechanism may inform schemes where historical age/order matters. This remains Open Question OQ29; Satisfactory playtime is not currently a historical calendar. Per-class research determines whether ordering matters.</w:t>
+      </w:r>
+    </w:p>
+    <w:p>
+      <w:pPr>
+        <w:pStyle w:val="Heading2"/>
+        <w:keepNext/>
+      </w:pPr>
+      <w:r>
+        <w:t>Manual renumbering — Agreed</w:t>
+      </w:r>
+    </w:p>
+    <w:p>
+      <w:pPr>
+        <w:keepLines/>
+      </w:pPr>
+      <w:r>
+        <w:t>Manual renumbering is a customisation feature enabled by a cheap AWESOME Shop-style unlock. Afterwards the player may edit permitted number portions; duplicates are rejected and scheme-controlled portions enforced. A manual value is retained in its regional mapping, including through return visits to that region. Later numbering-scheme changes preserve player-controlled digits where valid. Exact unlock cost, UI and technical integration remain OQ30.</w:t>
+      </w:r>
+    </w:p>
+    <w:p>
+      <w:pPr>
+        <w:pStyle w:val="Heading2"/>
+        <w:keepNext/>
+      </w:pPr>
+      <w:r>
+        <w:t>Number presentation and fleet search — Agreed direction</w:t>
+      </w:r>
+    </w:p>
+    <w:p>
+      <w:pPr>
+        <w:keepLines/>
+      </w:pPr>
+      <w:r>
+        <w:t>Display numbers in historically appropriate/canonical locations defined per locomotive class/model: possible surfaces include smokebox/front, tanks, cab, tender or bunker. Do not use a universal decal/socket transform or visually impossible placements. Painted/displayed numbering is the consistent simplification; reproducing physical brass/cast-plate manufacture is not a universal requirement. Exact locations/transforms belong in model asset data and require research.</w:t>
+      </w:r>
+    </w:p>
+    <w:p>
+      <w:pPr/>
+      <w:r>
+        <w:t>The visible number forms part of player-facing identity; [Class] — No. [Running Number] is an example format only. Fleet management, train/timetable identity, map search and locomotive lists are possible uses; the hidden Fleet Identity remains internal. Players should be able to search/filter locomotives/trains by running number and class. Desired map behaviour keeps matches prominent and dulls non-matches; list/sidebar behaviour filters non-matching entries out. 92214 and 9F illustrate specific-engine versus class searches, not a fixed UI specification. Exact UI integration remains OQ30, TECHNICAL VERIFICATION NEEDED.</w:t>
+      </w:r>
+    </w:p>
+    <w:p>
+      <w:pPr>
+        <w:pStyle w:val="Heading2"/>
+        <w:keepNext/>
+      </w:pPr>
+      <w:r>
+        <w:t>Historical numbering research and cards</w:t>
+      </w:r>
+    </w:p>
+    <w:p>
+      <w:pPr>
+        <w:keepLines/>
+      </w:pPr>
+      <w:r>
+        <w:t>Agreed research discipline: each supported region requires its own verified conventions. Do not transpose British logic onto North American, German/Central European, French, Japanese or other future regions; these examples do not approve a launch-region list. Do not force every operator into one arithmetic rule. On selecting each production class, research and record historical ranges, operator conventions, nationalisation/renumbering treatment, blocks/controlled portions, construction-order significance, number placement, livery compatibility and exceptions in a structured per-locomotive definition suitable for later implementation. LNER/GWR and others may need bespoke logic. User screenshots are supporting references until independently verified, not sufficient hardcoding evidence.</w:t>
+      </w:r>
+    </w:p>
+    <w:p>
+      <w:pPr/>
+      <w:r>
+        <w:t>Proposed: historical build cards may show a small secondary numbering note covering typical series, operator convention or class-range structure. Normal cards should not become full historical registries. Exact per-class data and algorithms remain OQ29.</w:t>
+      </w:r>
+    </w:p>
+    <w:p>
+      <w:pPr>
+        <w:pStyle w:val="Heading1"/>
+        <w:keepNext/>
+      </w:pPr>
+      <w:r>
         <w:t>Regional variants</w:t>
       </w:r>
     </w:p>
@@ -279,9 +468,11 @@
       </w:r>
     </w:p>
     <w:p>
-      <w:pPr/>
+      <w:pPr>
+        <w:keepLines/>
+      </w:pPr>
       <w:r>
-        <w:t>Regional presentation is a world/save-level setting, not a per-player visual preference: conflicting infrastructure styles would confuse multiplayer. Normal Core rolling stock follows one regional world style; cross-region mixing is not the normal Core design. Do not duplicate equivalent buildables merely to offer separate British/American/etc. versions of the same freight wagon.</w:t>
+        <w:t>Regional presentation is a world/save-level setting, not a per-player visual preference: conflicting infrastructure styles would confuse multiplayer. Normal Core regional selection follows the world style; connected wagon presentation follows the controlling locomotive rule below. Cross-region mixing is not the normal Core design. Do not duplicate equivalent buildables merely to offer separate British/American/etc. versions of the same freight wagon.</w:t>
       </w:r>
     </w:p>
     <w:p>
@@ -308,11 +499,36 @@
         <w:keepNext/>
       </w:pPr>
       <w:r>
+        <w:t>Consist regional presentation — Agreed</w:t>
+      </w:r>
+    </w:p>
+    <w:p>
+      <w:pPr>
+        <w:keepLines/>
+      </w:pPr>
+      <w:r>
+        <w:t>A connected consist derives wagon regional presentation from its controlling / lead locomotive's regional identity. A British controlling locomotive gives its wagons British presentation; a North American controlling locomotive gives North American presentation. An unconnected wagon follows the global world regional style. This supports coherent consists and regional rolling-stock mass/balance without duplicate regional wagon buildables.</w:t>
+      </w:r>
+    </w:p>
+    <w:p>
+      <w:pPr/>
+      <w:r>
+        <w:t>Do not define the controlling / lead locomotive solely by front-most mesh order. Determination for multiple locomotives, double-heading, banking, coupling/uncoupling, timetable ownership and multiple-unit operation remains technically unverified. Live reskin updates, cargo/resource preservation, regional wagon mass/data migration, save/load, replication and performance remain OQ06/OQ27. TECHNICAL VERIFICATION NEEDED; this presentation rule does not select a runtime implementation.</w:t>
+      </w:r>
+    </w:p>
+    <w:p>
+      <w:pPr>
+        <w:pStyle w:val="Heading2"/>
+        <w:keepNext/>
+      </w:pPr>
+      <w:r>
         <w:t>Regional performance — Agreed</w:t>
       </w:r>
     </w:p>
     <w:p>
-      <w:pPr/>
+      <w:pPr>
+        <w:keepLines/>
+      </w:pPr>
       <w:r>
         <w:t>Regional locomotive traditions may have meaningfully different absolute physical/performance characteristics. A North American locomotive may be heavier/more powerful while its corresponding rolling stock is also heavier; a British locomotive may have lower absolute power and lighter stock. These are illustrative principles, not selected classes or numeric specifications.</w:t>
       </w:r>
@@ -345,6 +561,9 @@
       </w:r>
     </w:p>
     <w:p>
+      <w:pPr>
+        <w:keepLines/>
+      </w:pPr>
       <w:r>
         <w:t>Agreed: steam locomotives need coal and water, loaded at a supplied station. Range should emerge from actual onboard capacities and consumption rather than an arbitrary distance countdown. Heavy loads, acceleration and climbing should increase demand; coasting should use less. A remaining range estimate was accepted as a useful interface direction.</w:t>
       </w:r>
@@ -374,6 +593,9 @@
       </w:r>
     </w:p>
     <w:p>
+      <w:pPr>
+        <w:keepLines/>
+      </w:pPr>
       <w:r>
         <w:t>Agreed: the steam station is substantially larger than a vanilla station, incorporating a water tower, coal conveyor or loading equipment and its signal box. It has coal and water inputs; the accepted interface suggestion is one conveyor fuel input and one pipe water input.</w:t>
       </w:r>
@@ -403,6 +625,9 @@
       </w:r>
     </w:p>
     <w:p>
+      <w:pPr>
+        <w:keepLines/>
+      </w:pPr>
       <w:r>
         <w:t>Agreed distinction: a normal tender comes with the larger locomotive and belongs in its base capacity and balance. An auxiliary tender is an additional vehicle that trades train length and hauling capacity for more range. The Small tank engine has no normal tender.</w:t>
       </w:r>
@@ -432,6 +657,9 @@
       </w:r>
     </w:p>
     <w:p>
+      <w:pPr>
+        <w:keepLines/>
+      </w:pPr>
       <w:r>
         <w:t>Agreed: separate trackside coal and water facilities enable journeys beyond a locomotive's ordinary range. Trains stop to replenish supplies, paying a time cost. A full cargo station should not be necessary for every service stop.</w:t>
       </w:r>
@@ -461,6 +689,9 @@
       </w:r>
     </w:p>
     <w:p>
+      <w:pPr>
+        <w:keepLines/>
+      </w:pPr>
       <w:r>
         <w:t>Agreed user interaction: select the higher tier railway, point it at existing early track and replace it in place, in the familiar manner of upgrading conveyors or miners. Preserve route planning rather than require players to rebuild their entire network from scratch.</w:t>
       </w:r>
@@ -500,6 +731,9 @@
       </w:r>
     </w:p>
     <w:p>
+      <w:pPr>
+        <w:keepLines/>
+      </w:pPr>
       <w:r>
         <w:t>Agreed: make early rail cheap and convenient to deploy, then balance it through meaningful operating demands. Do not use additional clicks as the main cost. Early steam should excel at long distance bulk movement while tractors retain flexibility and low route infrastructure requirements. Belts retain their role for permanent short and medium connections; electric rail should lead in mature speed, throughput, density and convenience.</w:t>
       </w:r>
@@ -534,7 +768,9 @@
       </w:r>
     </w:p>
     <w:p>
-      <w:pPr/>
+      <w:pPr>
+        <w:keepLines/>
+      </w:pPr>
       <w:r>
         <w:t>Agreed design constraint: Core and expansions share expressive locomotive gameplay/simulation with individual definitions; expansions must not delay current Core work. The class/inheritance decision remains unresolved. Proposed architecture: a shared SteamLocomotiveBase owns common fuel, water, traction, steam state, signalling and interface behaviour. Definitions hold performance values; model specific presentation supplies mesh, wheel configuration, rig, animation, steam emitters and audio. Wagon families share common behaviour with cargo, fluid and possible specialist variants.</w:t>
       </w:r>
@@ -559,7 +795,9 @@
       </w:r>
     </w:p>
     <w:p>
-      <w:pPr/>
+      <w:pPr>
+        <w:keepLines/>
+      </w:pPr>
       <w:r>
         <w:t>The 20 September 2026 addition is reconciled with the Manager-approved 1 October dispositions below. Concept approval does not establish API feasibility.</w:t>
       </w:r>
@@ -583,7 +821,9 @@
       </w:r>
     </w:p>
     <w:p>
-      <w:pPr/>
+      <w:pPr>
+        <w:keepLines/>
+      </w:pPr>
       <w:r>
         <w:t>Early Locomotion has its own scripted railway-focused assistant, distinct from ADA and voiced by the user/project creator. She is warm, bubbly, enthusiastic, expressive and competent as a teacher, strongly interested in railways, signalling, locomotives and engineering. Her warmer support-oriented presentation contrasts with ADA/FICSIT's colder corporate tone. She handles Early Locomotion narrative/voice presentation and supports integrated railway education.</w:t>
       </w:r>
@@ -604,7 +844,9 @@
       </w:r>
     </w:p>
     <w:p>
-      <w:pPr/>
+      <w:pPr>
+        <w:keepLines/>
+      </w:pPr>
       <w:r>
         <w:t>The assistant includes an always-accessible animated railway teaching/reference system. Lessons remain optional and replayable and become available progressively alongside relevant technology. The library remains accessible; individual lessons respect progression. Miniature demonstrations animate concepts, pause at important moments, highlight relevant objects/behaviour and use short explanatory captions. Avoid giant text walls.</w:t>
       </w:r>
@@ -631,7 +873,9 @@
       </w:r>
     </w:p>
     <w:p>
-      <w:pPr/>
+      <w:pPr>
+        <w:keepLines/>
+      </w:pPr>
       <w:r>
         <w:t>Windows XP audio is not intended release content. Use an original legally distinct retro-computer startup jingle; no third-party sound rights are assumed.</w:t>
       </w:r>
@@ -655,7 +899,9 @@
       </w:r>
     </w:p>
     <w:p>
-      <w:pPr/>
+      <w:pPr>
+        <w:keepLines/>
+      </w:pPr>
       <w:r>
         <w:t>On the first applicable Early Locomotion technology unlock, expected ADA-style presentation may begin, followed by interface glitches/interference, an apparent railway-assistant takeover, an original retro startup jingle and her introduction. The intended humour is surprising rather than sinister. Exact animation, sequence, dialogue, timing and trigger remain Proposed/Open; no ADA interception or independent recreation mechanism is selected.</w:t>
       </w:r>
@@ -670,7 +916,9 @@
       </w:r>
     </w:p>
     <w:p>
-      <w:pPr/>
+      <w:pPr>
+        <w:keepLines/>
+      </w:pPr>
       <w:r>
         <w:t>Older UI language, warmer support tone, obsolete/prototype styling, less productivity-obsessed wording and strange persistence in the modern system may imply an earlier FICSIT era. Do not canonise “FICSIT used to be good and was later corrupted.” Exact historical origin remains open.</w:t>
       </w:r>
@@ -685,7 +933,9 @@
       </w:r>
     </w:p>
     <w:p>
-      <w:pPr/>
+      <w:pPr>
+        <w:keepLines/>
+      </w:pPr>
       <w:r>
         <w:t>Specialised/common-mistakes lessons, advanced junction/passing-loop/signalling demonstrations, additional flavour dialogue/animations and milestone narration remain Proposed beyond the concept. A vertical subject/category list is one Proposed layout, not the final library UI.</w:t>
       </w:r>
@@ -702,6 +952,7 @@
     <w:p>
       <w:pPr>
         <w:pStyle w:val="ListBullet"/>
+        <w:keepLines/>
       </w:pPr>
       <w:r>
         <w:t>OQ15 — Character and presentation: Exact assistant name, introductory dialogue, avatar/visual design, palette and final library/UI layout remain open.</w:t>
@@ -741,7 +992,9 @@
       </w:r>
     </w:p>
     <w:p>
-      <w:pPr/>
+      <w:pPr>
+        <w:keepLines/>
+      </w:pPr>
       <w:r>
         <w:t>Proposed: Early Locomotion eventually has its own top-level build category rather than placing the entire system in vanilla Transport. Possible groups are Railway Infrastructure, Stations / Servicing, Signalling and Rolling Stock. Exact hierarchy/nesting remains OQ19. TECHNICAL VERIFICATION NEEDED for Satisfactory build-menu support; no API or implementation is established.</w:t>
       </w:r>
@@ -765,7 +1018,9 @@
       </w:r>
     </w:p>
     <w:p>
-      <w:pPr/>
+      <w:pPr>
+        <w:keepLines/>
+      </w:pPr>
       <w:r>
         <w:t>The expansion programme is a Proposed long-term post-Core direction. Agreed constraint: it must not delay Core, first playable implementation or Core 1.0. Core must be complete, polished and satisfying; do not deliberately weaken or leave Core locomotives incomplete to sell expansions. Core retains its identity as Satisfactory with a distinct early steam railway system. Expansion value would come from breadth, historical variety, specialisation, enthusiast depth, advanced operation and infrastructure.</w:t>
       </w:r>
@@ -786,7 +1041,9 @@
       </w:r>
     </w:p>
     <w:p>
-      <w:pPr/>
+      <w:pPr>
+        <w:keepLines/>
+      </w:pPr>
       <w:r>
         <w:t>Separate regional enthusiast packs may add expanded fleets, region-specific advanced infrastructure presentation, enthusiast systems and historical/livery content. Approximately £10 GBP per pack is a Proposed planning target only; exact price is open. Pricing, storefront, entitlement, distribution and commercial permission are not technically or legally settled.</w:t>
       </w:r>
@@ -807,7 +1064,9 @@
       </w:r>
     </w:p>
     <w:p>
-      <w:pPr/>
+      <w:pPr>
+        <w:keepLines/>
+      </w:pPr>
       <w:r>
         <w:t>Without expansions, Small / Medium / Large remains the simple primary Core selection. With a substantially expanded enthusiast roster, browsing should move to historical/operational role categories. Core locomotives remain available and are reclassified into that catalogue. Shunters, Mixed Traffic, Express Freight / Fast Freight and Heavy Freight are candidate names only. A category explains a locomotive family/role; its individual card explains that machine's strengths and duties. Exact category names remain open.</w:t>
       </w:r>
@@ -840,7 +1099,9 @@
       </w:r>
     </w:p>
     <w:p>
-      <w:pPr/>
+      <w:pPr>
+        <w:keepLines/>
+      </w:pPr>
       <w:r>
         <w:t>Agreed: expansion locomotive cards separate HISTORY / CHARACTER from EARLY LOCOMOTION GAMEPLAY. History gives a short researched introduction covering class, designer/builder/operator, introduction era/year, intended historical purpose and useful reputation/story. Gameplay states duties, strengths, weaknesses and practical role. Research class-specific history when developing rosters; no roster is approved here.</w:t>
       </w:r>
@@ -861,7 +1122,9 @@
       </w:r>
     </w:p>
     <w:p>
-      <w:pPr/>
+      <w:pPr>
+        <w:keepLines/>
+      </w:pPr>
       <w:r>
         <w:t>Agreed: vanilla electric monorail remains technically superior overall even with expansions. High-end steam may remain late-game viable in specialised roles through physical scale: large terminals, many tracks/trains, substantial signalling/servicing and large railway complexes. Electric remains compact, efficient, convenient and high-density; steam's scale/volume ambition does not make it objectively better.</w:t>
       </w:r>
@@ -884,13 +1147,21 @@
         <w:keepNext/>
       </w:pPr>
       <w:r>
-        <w:t>Expansion locomotive region switching — Open Question</w:t>
+        <w:t>Expansion locomotive region switching — Agreed fallback</w:t>
+      </w:r>
+    </w:p>
+    <w:p>
+      <w:pPr>
+        <w:keepLines/>
+      </w:pPr>
+      <w:r>
+        <w:t>If no valid corresponding owned expansion locomotive is available in the newly selected world region, the existing expansion locomotive does not transform: it retains regional/national identity, presentation and running number. Core locomotives and other stock with valid regional replacements may still transform normally. “No nationality change → no new VISA” is design shorthand only, not required UI text. The high-level fallback is now resolved; valid correspondence, transformations when available, advanced-asset fallback and technical migration remain OQ23.</w:t>
       </w:r>
     </w:p>
     <w:p>
       <w:pPr/>
       <w:r>
-        <w:t>OQ23 includes a British expansion-exclusive locomotive remaining in a save after switching world style to North American without owning that pack. No transformation mapping, fallback machine, restriction or retention rule is selected. With multiple packs, whether machines transform into equivalent regional classes is also open. Do not force identical roster structures to enable mapping.</w:t>
+        <w:t>Agreed: regional expansion rosters need not have identical role counts or class-to-class symmetry. Do not force equal shunter, Mixed Traffic or Heavy Freight counts or artificial equivalents merely to enable switching. Each region should represent plausible/useful locomotives from its tradition; final rosters remain future research/design work (OQ20).</w:t>
       </w:r>
     </w:p>
     <w:p>
@@ -899,25 +1170,56 @@
         <w:keepNext/>
       </w:pPr>
       <w:r>
-        <w:t>Advanced manual driving</w:t>
+        <w:t>Expansion progression</w:t>
+      </w:r>
+    </w:p>
+    <w:p>
+      <w:pPr>
+        <w:keepLines/>
+      </w:pPr>
+      <w:r>
+        <w:t>Agreed philosophy: ownership does not immediately grant advanced/endgame steam content. Expansions progress alongside Core: early/small expansion machines unlock around comparable Core stages; more capable machines and infrastructure unlock around Heavy Steam or later progression. Exact unlocks remain open.</w:t>
       </w:r>
     </w:p>
     <w:p>
       <w:pPr/>
       <w:r>
-        <w:t>Agreed direction: advanced manual steam driving is an optional/toggleable enthusiast expansion feature. Normal Simple controls remain available and are the default. First relevant expansion use/launch presents SIMPLE CONTROLS versus ADVANCED STEAM CONTROLS, with Simple preselected and clear notice that the choice can change later. The assistant may present the choice. SML/SMM configuration implementation remains unverified.</w:t>
+        <w:t>Proposed implementation preference: integrate unlocks into existing Early Locomotion milestones where practical. If technically awkward, use parallel/additional clearly labelled expansion milestones. Exact milestone integration/API remains OQ20, TECHNICAL VERIFICATION NEEDED.</w:t>
+      </w:r>
+    </w:p>
+    <w:p>
+      <w:pPr>
+        <w:pStyle w:val="Heading2"/>
+        <w:keepNext/>
+      </w:pPr>
+      <w:r>
+        <w:t>Advanced manual driving — refined Agreed scope</w:t>
+      </w:r>
+    </w:p>
+    <w:p>
+      <w:pPr>
+        <w:keepLines/>
+      </w:pPr>
+      <w:r>
+        <w:t>Advanced manual steam driving remains expansion-only, optional/toggleable. Simple remains available, default and preselected. First relevant use presents Simple versus Advanced with notice that settings can change later; the assistant may explain it. Technical configuration/input APIs remain unverified.</w:t>
       </w:r>
     </w:p>
     <w:p>
       <w:pPr/>
       <w:r>
-        <w:t>Proposed exploration: reverser/cutoff, regulator/throttle, locomotive brake, firing/firebox, steam pressure and possibly boiler water/injectors. A conceptual loop links fire/heat/water, steam/pressure, regulator consumption, cutoff tradeoffs and anticipating gradients/heavy starts; it is not an approved final physics model. Boiler water, injectors, firing depth, pressure limits, reverser modelling, failure consequences and stall/performance penalties remain OQ24. Catastrophic boiler explosions/damage are not an approved requirement.</w:t>
+        <w:t>Agreed: meaningful steam-engine operation without full professional locomotive simulation. Primary player-managed systems are coal/firebox management, regulator/throttle and reverser/cutoff; braking remains part of driving where required. Manual injectors, detailed boiler-water management, blower/damper simulation, dozens of cab valves and engineering-procedure simulation are not currently required features. The earlier broader exploratory loop is narrowed by this approval. Steam and Steel may later be researched as a conceptual interaction reference only; do not copy formulas without verification/design review.</w:t>
       </w:r>
     </w:p>
     <w:p>
       <w:pPr/>
       <w:r>
-        <w:t>Proposed/Open: Simple could behave as a competent automatic crew managing complex steam systems; skilful Advanced operation might provide engagement and possibly modest efficiency/performance benefits. Do not make Simple deliberately bad to force Advanced. The performance relationship remains OQ24.</w:t>
+        <w:t>Agreed: poor operation produces natural performance consequences rather than arbitrary punishment. Unsuitable regulator/reverser use reduces effective hauling; excessive power/cutoff combinations may cause wheel slip; insufficient steam pressure reduces available power; weak fire/steam management reduces performance. Boiler explosions, permanent boiler damage, locomotive destruction and catastrophic punishment are not required. Exact formulas, pressure/reverser behaviour and wheel-slip model remain OQ24.</w:t>
+      </w:r>
+    </w:p>
+    <w:p>
+      <w:pPr/>
+      <w:r>
+        <w:t>Agreed: Simple behaves like a competent automatic crew / automatic transmission: the player provides basic movement intent and the game handles detailed steam operation. Advanced is manual operation, allowing a skilled player to prepare for gradients, hold power, trade efficiency for short-term output and manage immediate needs. Simple must remain competent and useful. Advanced may offer a modest skill ceiling and potentially somewhat better useful performance; the exact amount/shape of that advantage remains OQ24. Do not intentionally cripple Simple.</w:t>
       </w:r>
     </w:p>
     <w:p>
@@ -930,7 +1232,9 @@
       </w:r>
     </w:p>
     <w:p>
-      <w:pPr/>
+      <w:pPr>
+        <w:keepLines/>
+      </w:pPr>
       <w:r>
         <w:t>Agreed expansion principle: historical liveries are prominent, with an appropriate/default historical presentation where feasible and possible additional historical liveries. FICSIT/custom corporate styles remain possible. Historical liveries must not become separate real-money microtransactions within an owned expansion proposal. Customizer/AWESOME Shop integration is Proposed and technically unverified; exact livery integration and relevant licensing remain OQ25.</w:t>
       </w:r>
@@ -942,9 +1246,50 @@
       </w:r>
     </w:p>
     <w:p>
+      <w:pPr>
+        <w:pStyle w:val="Heading2"/>
+        <w:keepNext/>
+      </w:pPr>
+      <w:r>
+        <w:t>VIP / Prestige locomotive framework — Agreed</w:t>
+      </w:r>
+    </w:p>
+    <w:p>
+      <w:pPr>
+        <w:keepLines/>
+      </w:pPr>
+      <w:r>
+        <w:t>VIP / Prestige locomotives are extremely expensive enthusiast/show-off rewards for display, collection, screenshots and bragging rights, analogous in spirit to Golden Nut / Golden FICSIT Cup prestige rewards. They are not superior logistics upgrades. Exact prices remain OQ25.</w:t>
+      </w:r>
+    </w:p>
+    <w:p>
       <w:pPr/>
       <w:r>
-        <w:t>Proposed: famous locomotives may be special enthusiast, prestige/cameo additions or AWESOME Shop-style unlocks within an owned pack where appropriate. Flying Scotsman and Mallard are examples only; no cameo roster is approved. Names, trademarks, liveries and licensing require verification before commercial release (OQ25).</w:t>
+        <w:t>Expansion VIPs represent specific famous historical machines with fixed historical identity, name and number, no procedural fleet number, one-per-world/save where appropriate, and extremely expensive prestige/AWESOME-style unlocks. Practical freight utility is deliberately poor; high speed must not make them logistics-meta. Mallard and Flying Scotsman remain examples only, not an approved roster. Name/trademark/livery licensing review remains required.</w:t>
+      </w:r>
+    </w:p>
+    <w:p>
+      <w:pPr/>
+      <w:r>
+        <w:t>Core prestige normally selects a special historical individual from an existing Core locomotive class rather than an unrelated celebrity engine, keeping it understandable to non-enthusiasts. It has fixed identity/name/number, special livery/presentation, prestige treatment and one-per-world where appropriate. If 9F remains British Large/Core, Evening Star is an example only; it is not approved here.</w:t>
+      </w:r>
+    </w:p>
+    <w:p>
+      <w:pPr/>
+      <w:r>
+        <w:t>Normal locomotives are generated, normally unnamed class members; VIPs are fixed historical individuals. VIPs ignore procedural numbering and retain fixed name, number and identity through rerolls, global numbering-mode changes, manual renumbering and procedural regional replacement.</w:t>
+      </w:r>
+    </w:p>
+    <w:p>
+      <w:pPr/>
+      <w:r>
+        <w:t>Proposed: suitable prestige/historical passenger stock may accompany expansion VIPs for appearance, display and showpiece consists. Exact coach roster remains OQ25; this adds no normal passenger economy, and full passenger simulation is outside scope unless separately approved.</w:t>
+      </w:r>
+    </w:p>
+    <w:p>
+      <w:pPr/>
+      <w:r>
+        <w:t>Proposed flavour: the assistant may recognise VIPs and react enthusiastically to purchase or first placement, briefly losing professional composure. Avoid repeated lengthy dialogue on every placement. Exact dialogue remains future writing work.</w:t>
       </w:r>
     </w:p>
     <w:p>
@@ -957,7 +1302,9 @@
       </w:r>
     </w:p>
     <w:p>
-      <w:pPr/>
+      <w:pPr>
+        <w:keepLines/>
+      </w:pPr>
       <w:r>
         <w:t>Agreed desired outcome: friends should ideally not need a separate enthusiast-content purchase simply to join/play with an owner, if technically, legally and commercially viable. This is not verified server-side DLC. Client installation/asset requirements and commercial entitlement are distinct. Client assets, mod loading, server dependencies, entitlement, save compatibility and differing pack availability remain OQ27.</w:t>
       </w:r>
@@ -978,7 +1325,9 @@
       </w:r>
     </w:p>
     <w:p>
-      <w:pPr/>
+      <w:pPr>
+        <w:keepLines/>
+      </w:pPr>
       <w:r>
         <w:t>Exact pack pricing, early-access pricing, paid distribution/storefront and commercial/platform permission remain OQ26. Patreon, external purchases and manual installation are unapproved ideas, not implementation plans. Investigation must cover Coffee Stain and Satisfactory Modding policies, SML/SMR rules, redistribution, commercial permissions, platform terms, entitlement, updates, dependencies and licensing. TECHNICAL VERIFICATION NEEDED, plus legal/commercial verification; no promise of sale or distribution mechanism is established.</w:t>
       </w:r>
@@ -995,6 +1344,7 @@
     <w:p>
       <w:pPr>
         <w:pStyle w:val="ListBullet"/>
+        <w:keepLines/>
       </w:pPr>
       <w:r>
         <w:t>OQ01 Progression: approve exact milestones, prerequisites and service point unlocks.</w:t>
@@ -1037,7 +1387,7 @@
         <w:pStyle w:val="ListBullet"/>
       </w:pPr>
       <w:r>
-        <w:t>OQ06 Regions: select exact supported Core launch regions and references; specify world/save selection and existing/future presentation switching, fallback, save/load migration, dynamic versus construction-fixed mass/performance, already-running trains, total train mass display, transient/exploit states and coherent migration. Identical class statistics are Superseded; regional balance values remain unset.</w:t>
+        <w:t>OQ06 Regions: select exact supported Core launch regions/references and world/save selection; verify existing/future switching, controlling/parent locomotive determination for multi-locomotive consists, live wagon reskin updates, cargo/resource preservation, regional wagon mass/data migration, dynamic versus construction-fixed performance, already-running trains, total mass display, save/load, replication, performance and transient/exploit safeguards. The controlling-locomotive presentation rule is Agreed; its implementation is not. Identical statistics are Superseded; balance values remain unset.</w:t>
       </w:r>
     </w:p>
     <w:p>
@@ -1125,7 +1475,7 @@
         <w:pStyle w:val="ListBullet"/>
       </w:pPr>
       <w:r>
-        <w:t>OQ20 Expansion catalogue: exact pack names, release/update roster and strategy, deliberate total cap and historical/operational role-category names. No suggested counts are commitments.</w:t>
+        <w:t>OQ20 Expansion catalogue and progression: exact pack names, release/update roster/strategy, deliberate total cap, role-category names and unlock stages; verify existing-milestone integration API versus Proposed parallel/additional labelled milestones. Symmetric regional role counts/equivalents are not required. No suggested roster counts are commitments.</w:t>
       </w:r>
     </w:p>
     <w:p>
@@ -1149,7 +1499,7 @@
         <w:pStyle w:val="ListBullet"/>
       </w:pPr>
       <w:r>
-        <w:t>OQ23 Expansion regional migration: expansion-only locomotive handling across world-region switches with missing/multiple packs; advanced regional-asset fallback; no mapping, retention, restriction or fallback rule selected.</w:t>
+        <w:t>OQ23 Expansion regional migration: valid owned correspondence and transformation handling when available, missing/multiple-pack technical migration and advanced regional-asset fallback. High-level locomotive fallback is resolved: no valid corresponding owned destination locomotive means retain current identity/presentation/number. No technical mapping, storage or migration mechanism is chosen.</w:t>
       </w:r>
     </w:p>
     <w:p>
@@ -1157,7 +1507,7 @@
         <w:pStyle w:val="ListBullet"/>
       </w:pPr>
       <w:r>
-        <w:t>OQ24 Advanced driving: exact simulation depth, boiler water/injectors, firing, pressure limits, reverser, failures/stalls and Simple-versus-Advanced performance. Configuration and input implementation require verification.</w:t>
+        <w:t>OQ24 Advanced driving: exact firebox/pressure/regulator/reverser formulas, wheel-slip model, natural performance consequences and amount/shape of a modest potential Advanced advantage. Simple is competent automatic operation; injectors, detailed boiler-water/blower/damper/cab-valve simulation and catastrophic damage are not current required features. Configuration/input implementation needs verification.</w:t>
       </w:r>
     </w:p>
     <w:p>
@@ -1165,7 +1515,7 @@
         <w:pStyle w:val="ListBullet"/>
       </w:pPr>
       <w:r>
-        <w:t>OQ25 Liveries and cameos: exact livery integration, Customizer/AWESOME support, cameo roster and name/trademark/livery licensing.</w:t>
+        <w:t>OQ25 Liveries and VIP/prestige content: exact livery integration, Customizer/AWESOME support, Core/expansion VIP rosters and prices, one-per-world applicability, prestige passenger coach roster, dialogue and name/trademark/livery licensing. Named examples are not approved selections; the Agreed prestige framework is not a logistics upgrade or passenger economy.</w:t>
       </w:r>
     </w:p>
     <w:p>
@@ -1181,7 +1531,31 @@
         <w:pStyle w:val="ListBullet"/>
       </w:pPr>
       <w:r>
-        <w:t>OQ27 Multiplayer expansions: client assets/install/mod loading, server dependencies, entitlement, save compatibility, differing pack availability and feasibility of the join-without-extra-purchase goal.</w:t>
+        <w:t>OQ27 Multiplayer expansions: client assets/install/mod loading, server dependencies, entitlement, save compatibility, differing pack availability and feasibility of joining without extra purchase; replication/save/performance implications of consist regional updates. No entitlement or runtime mechanism is verified.</w:t>
+      </w:r>
+    </w:p>
+    <w:p>
+      <w:pPr>
+        <w:pStyle w:val="ListBullet"/>
+      </w:pPr>
+      <w:r>
+        <w:t>OQ28 Fleet Identity: verify placement lifecycle hooks, permanent identity persistence/storage, regional mapping save/load, dismantling/deletion lifecycle and replication. No SQL/external database requirement or API is chosen.</w:t>
+      </w:r>
+    </w:p>
+    <w:p>
+      <w:pPr>
+        <w:pStyle w:val="ListBullet"/>
+      </w:pPr>
+      <w:r>
+        <w:t>OQ29 Numbering rules/data: define collision pool/domain, independently verified per-class/operator/regional algorithms and datasets, construction-order relevance, scheme conversion, controlled/player-controlled portions, manual-value validity and overflow prefix/format. Do not treat playtime as a historical calendar or screenshots as verified data.</w:t>
+      </w:r>
+    </w:p>
+    <w:p>
+      <w:pPr>
+        <w:pStyle w:val="ListBullet"/>
+      </w:pPr>
+      <w:r>
+        <w:t>OQ30 Numbering customisation/UI: exact cheap renumber-unlock price, AWESOME-style integration, editing/duplicate validation, player-facing number locations in UI and fleet search/filter integration. Map prominence/dulling and list filtering are Agreed desired behaviour; APIs and final UI remain unverified.</w:t>
       </w:r>
     </w:p>
     <w:p>
@@ -1194,6 +1568,9 @@
       </w:r>
     </w:p>
     <w:p>
+      <w:pPr>
+        <w:keepLines/>
+      </w:pPr>
       <w:r>
         <w:t>Version 0.1 created on 14 September 2026. Consolidates the initial concept, detailed balance discussion, user corrections on rail length and tenders, the regional chassis correction, animated servicing requirements and the final conventional rail versus monorail distinction.</w:t>
       </w:r>
@@ -1208,6 +1585,12 @@
       <w:pPr/>
       <w:r>
         <w:t>1 October 2026: reconciled Manager-approved assistant/tutorial, generated linkage, world-region and regional-performance direction; identical regional statistics are Superseded. Added a clearly post-Core Proposed enthusiast programme, agreed scope/foundation/compatibility constraints, OQ19–OQ27 and revised OQ04/OQ06/OQ13/OQ15–OQ18. No implementation or remaining Open Question is resolved.</w:t>
+      </w:r>
+    </w:p>
+    <w:p>
+      <w:pPr/>
+      <w:r>
+        <w:t>2 October 2026: applied Manager-approved numbering/Advanced Driving/VIP refinements. Resolved high-level expansion locomotive retention fallback; agreed controlling-locomotive wagon presentation and asymmetric regional rosters. Added Core identity/numbering/search family, refined Advanced scope/Simple relationship, expansion progression and Core/expansion prestige framework. Revised OQ06/OQ20/OQ23–OQ25/OQ27; added OQ28–OQ30. Technical mechanisms, exact values, roster, licensing and Proposed details remain open. No gameplay implementation is claimed.</w:t>
       </w:r>
     </w:p>
     <w:p>

</xml_diff>

<commit_message>
Prioritize singleplayer Core and defer multiplayer
</commit_message>
<xml_diff>
--- a/Design/Early Locomotion Design Reference.docx
+++ b/Design/Early Locomotion Design Reference.docx
@@ -45,6 +45,146 @@
     <w:p>
       <w:r>
         <w:t>Status convention: Agreed identifies explicit user choices or earlier suggestions covered by the user's statement that unchallenged points were accepted. Proposed identifies subsequent assistant elaborations not expressly confirmed. Playtest target identifies illustrative values, even when their underlying principle is agreed. Superseded identifies an earlier idea replaced by a later correction. No numerical targets in this reference are final unless explicitly stated otherwise.</w:t>
+      </w:r>
+    </w:p>
+    <w:p>
+      <w:pPr>
+        <w:pStyle w:val="Heading1"/>
+      </w:pPr>
+      <w:r>
+        <w:t>Release scope and implementation order</w:t>
+      </w:r>
+    </w:p>
+    <w:p>
+      <w:pPr/>
+      <w:r>
+        <w:t>Agreed: Core 1.0 / the first public release prioritises a complete, robust singleplayer experience. Multiplayer support is deferred to a post-release update and is not a Core release requirement or blocker. Listen-server, dedicated-server, client replication and multiplayer-specific UI/presentation validation are deferred.</w:t>
+      </w:r>
+    </w:p>
+    <w:p>
+      <w:pPr/>
+      <w:r>
+        <w:t>Multiplayer validation requires additional accounts/machines and substantial replication, server and cross-client testing overhead. Singleplayer must work properly before significant multiplayer implementation/validation work.</w:t>
+      </w:r>
+    </w:p>
+    <w:p>
+      <w:pPr/>
+      <w:r>
+        <w:t>Agreed implementation discipline: where reasonably cheap, maintain server-authoritative ownership of mutable gameplay state, use replication-friendly structures and avoid knowingly making future multiplayer unnecessarily difficult. Unverified multiplayer behaviour is labelled deferred; it must not block singleplayer development. This does not verify any networking mechanism.</w:t>
+      </w:r>
+    </w:p>
+    <w:p>
+      <w:pPr/>
+      <w:r>
+        <w:t>Agreed: singleplayer persistence and save/load correctness remain Core requirements. Multiplayer replication and multiplayer save/session semantics are separate, deferred post-release questions; their technical answers remain Open Question.</w:t>
+      </w:r>
+    </w:p>
+    <w:p>
+      <w:pPr/>
+      <w:r>
+        <w:t>Agreed development priority (grouping may adapt to verified technical dependencies; this order does not select final architecture):</w:t>
+      </w:r>
+    </w:p>
+    <w:p>
+      <w:pPr>
+        <w:pStyle w:val="ListNumber"/>
+      </w:pPr>
+      <w:r>
+        <w:t>Singleplayer locomotive architecture assessment and selection after Manager review.</w:t>
+      </w:r>
+    </w:p>
+    <w:p>
+      <w:pPr>
+        <w:pStyle w:val="ListNumber"/>
+      </w:pPr>
+      <w:r>
+        <w:t>Production steam readiness and traction.</w:t>
+      </w:r>
+    </w:p>
+    <w:p>
+      <w:pPr>
+        <w:pStyle w:val="ListNumber"/>
+      </w:pPr>
+      <w:r>
+        <w:t>Rolling stock.</w:t>
+      </w:r>
+    </w:p>
+    <w:p>
+      <w:pPr>
+        <w:pStyle w:val="ListNumber"/>
+      </w:pPr>
+      <w:r>
+        <w:t>Track.</w:t>
+      </w:r>
+    </w:p>
+    <w:p>
+      <w:pPr>
+        <w:pStyle w:val="ListNumber"/>
+      </w:pPr>
+      <w:r>
+        <w:t>Stations and servicing.</w:t>
+      </w:r>
+    </w:p>
+    <w:p>
+      <w:pPr>
+        <w:pStyle w:val="ListNumber"/>
+      </w:pPr>
+      <w:r>
+        <w:t>Signalling.</w:t>
+      </w:r>
+    </w:p>
+    <w:p>
+      <w:pPr>
+        <w:pStyle w:val="ListNumber"/>
+      </w:pPr>
+      <w:r>
+        <w:t>Progression recipes and unlocks.</w:t>
+      </w:r>
+    </w:p>
+    <w:p>
+      <w:pPr>
+        <w:pStyle w:val="ListNumber"/>
+      </w:pPr>
+      <w:r>
+        <w:t>UI presentation and tutorials as applicable.</w:t>
+      </w:r>
+    </w:p>
+    <w:p>
+      <w:pPr>
+        <w:pStyle w:val="ListNumber"/>
+      </w:pPr>
+      <w:r>
+        <w:t>Singleplayer save/load robustness.</w:t>
+      </w:r>
+    </w:p>
+    <w:p>
+      <w:pPr>
+        <w:pStyle w:val="ListNumber"/>
+      </w:pPr>
+      <w:r>
+        <w:t>Balance packaging and singleplayer release QA.</w:t>
+      </w:r>
+    </w:p>
+    <w:p>
+      <w:pPr>
+        <w:pStyle w:val="ListNumber"/>
+      </w:pPr>
+      <w:r>
+        <w:t>Core 1.0 singleplayer release.</w:t>
+      </w:r>
+    </w:p>
+    <w:p>
+      <w:pPr>
+        <w:pStyle w:val="ListNumber"/>
+      </w:pPr>
+      <w:r>
+        <w:t>Post-release multiplayer implementation and validation.</w:t>
+      </w:r>
+    </w:p>
+    <w:p>
+      <w:pPr/>
+      <w:r>
+        <w:t>Multiplayer release timing is decided; replication mechanisms, client prediction, dedicated-server behaviour and exact multiplayer save/session semantics remain unresolved. OQ04/OQ06/OQ14/OQ27/OQ28 retain their multiplayer technical questions for post-release work; their singleplayer persistence/performance requirements remain active.</w:t>
       </w:r>
     </w:p>
     <w:p>
@@ -1371,7 +1511,7 @@
         <w:pStyle w:val="ListBullet"/>
       </w:pPr>
       <w:r>
-        <w:t>OQ04 Signal boxes: settle capacity, territory measurement, overlap and reassignment; generated linkage appearance, routing/branching, continuity, equipment coverage including points, regeneration, clutter, LOD/performance and multiplayer presentation.</w:t>
+        <w:t>OQ04 Signal boxes: settle capacity, territory measurement, overlap and reassignment; generated linkage appearance, routing/branching, continuity, equipment coverage including points, regeneration, clutter, LOD/performance and multiplayer presentation. Multiplayer-specific validation is deferred post-release; applicable singleplayer requirements remain Core.</w:t>
       </w:r>
     </w:p>
     <w:p>
@@ -1387,7 +1527,7 @@
         <w:pStyle w:val="ListBullet"/>
       </w:pPr>
       <w:r>
-        <w:t>OQ06 Regions: select exact supported Core launch regions/references and world/save selection; verify existing/future switching, controlling/parent locomotive determination for multi-locomotive consists, live wagon reskin updates, cargo/resource preservation, regional wagon mass/data migration, dynamic versus construction-fixed performance, already-running trains, total mass display, save/load, replication, performance and transient/exploit safeguards. The controlling-locomotive presentation rule is Agreed; its implementation is not. Identical statistics are Superseded; balance values remain unset.</w:t>
+        <w:t>OQ06 Regions: select exact supported Core launch regions/references and world/save selection; verify existing/future switching, controlling/parent locomotive determination for multi-locomotive consists, live wagon reskin updates, cargo/resource preservation, regional wagon mass/data migration, dynamic versus construction-fixed performance, already-running trains, total mass display, save/load, replication, performance and transient/exploit safeguards. The controlling-locomotive presentation rule is Agreed; its implementation is not. Identical statistics are Superseded; balance values remain unset. Multiplayer-specific validation is deferred post-release; applicable singleplayer requirements remain Core.</w:t>
       </w:r>
     </w:p>
     <w:p>
@@ -1451,7 +1591,7 @@
         <w:pStyle w:val="ListBullet"/>
       </w:pPr>
       <w:r>
-        <w:t>OQ14 Implementation: choose and verify game, mod loader and editor versions, then establish multiplayer, save and load, performance and build validation requirements.</w:t>
+        <w:t>OQ14 Implementation: verify toolchain, singleplayer architecture, singleplayer persistence/save-load correctness, performance and build/release validation. Core 1.0 is singleplayer; multiplayer implementation/validation is post-release. Replication mechanisms, listen/dedicated-server behaviour, client prediction and multiplayer save/session semantics remain unresolved, not Core blockers.</w:t>
       </w:r>
     </w:p>
     <w:p>
@@ -1531,7 +1671,7 @@
         <w:pStyle w:val="ListBullet"/>
       </w:pPr>
       <w:r>
-        <w:t>OQ27 Multiplayer expansions: client assets/install/mod loading, server dependencies, entitlement, save compatibility, differing pack availability and feasibility of joining without extra purchase; replication/save/performance implications of consist regional updates. No entitlement or runtime mechanism is verified.</w:t>
+        <w:t>OQ27 Multiplayer expansions: client assets/install/mod loading, server dependencies, entitlement, save compatibility, differing pack availability and feasibility of joining without extra purchase; replication/save/performance implications of consist regional updates. No entitlement or runtime mechanism is verified. Multiplayer implementation/validation is deferred post-release; no technical answer or entitlement mechanism is selected, and singleplayer save/load remains a Core requirement.</w:t>
       </w:r>
     </w:p>
     <w:p>
@@ -1539,7 +1679,7 @@
         <w:pStyle w:val="ListBullet"/>
       </w:pPr>
       <w:r>
-        <w:t>OQ28 Fleet Identity: verify placement lifecycle hooks, permanent identity persistence/storage, regional mapping save/load, dismantling/deletion lifecycle and replication. No SQL/external database requirement or API is chosen.</w:t>
+        <w:t>OQ28 Fleet Identity: verify placement lifecycle hooks, permanent identity persistence/storage, regional mapping save/load, dismantling/deletion lifecycle and replication. No SQL/external database requirement or API is chosen. Multiplayer-specific validation is deferred post-release; applicable singleplayer requirements remain Core.</w:t>
       </w:r>
     </w:p>
     <w:p>
@@ -1596,6 +1736,11 @@
     <w:p>
       <w:r>
         <w:t>Future revisions should update the relevant section, change its status where appropriate, record the reason and source in CHANGELOG.md, and resolve the corresponding open question. Preserve superseded decisions in the change history rather than leave conflicting instructions active.</w:t>
+      </w:r>
+    </w:p>
+    <w:p>
+      <w:r>
+        <w:t>2026-10-03: Manager/user-approved singleplayer-first Core 1.0 scope; multiplayer support and validation deferred post-release. Singleplayer save/load remains required. Multiplayer technical questions stay open; no production architecture selected.</w:t>
       </w:r>
     </w:p>
     <w:sectPr>

</xml_diff>